<commit_message>
fix: atualiza template de manutencao e placeholders da os
</commit_message>
<xml_diff>
--- a/apps/backend/templates/sige-ordem-servico-avulsa-externa.docx
+++ b/apps/backend/templates/sige-ordem-servico-avulsa-externa.docx
@@ -1,6 +1,6 @@
 
 <file path=word/document.xml><?xml version="1.0" encoding="utf-8"?>
-<w:document xmlns:wpc="http://schemas.microsoft.com/office/word/2010/wordprocessingCanvas" xmlns:cx="http://schemas.microsoft.com/office/drawing/2014/chartex" xmlns:cx1="http://schemas.microsoft.com/office/drawing/2015/9/8/chartex" xmlns:cx2="http://schemas.microsoft.com/office/drawing/2015/10/21/chartex" xmlns:cx3="http://schemas.microsoft.com/office/drawing/2016/5/9/chartex" xmlns:cx4="http://schemas.microsoft.com/office/drawing/2016/5/10/chartex" xmlns:cx5="http://schemas.microsoft.com/office/drawing/2016/5/11/chartex" xmlns:cx6="http://schemas.microsoft.com/office/drawing/2016/5/12/chartex" xmlns:cx7="http://schemas.microsoft.com/office/drawing/2016/5/13/chartex" xmlns:cx8="http://schemas.microsoft.com/office/drawing/2016/5/14/chartex" xmlns:mc="http://schemas.openxmlformats.org/markup-compatibility/2006" xmlns:aink="http://schemas.microsoft.com/office/drawing/2016/ink" xmlns:am3d="http://schemas.microsoft.com/office/drawing/2017/model3d" xmlns:o="urn:schemas-microsoft-com:office:office" xmlns:oel="http://schemas.microsoft.com/office/2019/extlst" xmlns:r="http://schemas.openxmlformats.org/officeDocument/2006/relationships" xmlns:m="http://schemas.openxmlformats.org/officeDocument/2006/math" xmlns:v="urn:schemas-microsoft-com:vml" xmlns:wp14="http://schemas.microsoft.com/office/word/2010/wordprocessingDrawing" xmlns:wp="http://schemas.openxmlformats.org/drawingml/2006/wordprocessingDrawing" xmlns:w10="urn:schemas-microsoft-com:office:word" xmlns:w="http://schemas.openxmlformats.org/wordprocessingml/2006/main" xmlns:w14="http://schemas.microsoft.com/office/word/2010/wordml" xmlns:w15="http://schemas.microsoft.com/office/word/2012/wordml" xmlns:w16cex="http://schemas.microsoft.com/office/word/2018/wordml/cex" xmlns:w16cid="http://schemas.microsoft.com/office/word/2016/wordml/cid" xmlns:w16="http://schemas.microsoft.com/office/word/2018/wordml" xmlns:w16sdtdh="http://schemas.microsoft.com/office/word/2020/wordml/sdtdatahash" xmlns:w16se="http://schemas.microsoft.com/office/word/2015/wordml/symex" xmlns:wpg="http://schemas.microsoft.com/office/word/2010/wordprocessingGroup" xmlns:wpi="http://schemas.microsoft.com/office/word/2010/wordprocessingInk" xmlns:wne="http://schemas.microsoft.com/office/word/2006/wordml" xmlns:wps="http://schemas.microsoft.com/office/word/2010/wordprocessingShape" mc:Ignorable="w14 w15 w16se w16cid w16 w16cex w16sdtdh wp14">
+<w:document xmlns:wpc="http://schemas.microsoft.com/office/word/2010/wordprocessingCanvas" xmlns:cx="http://schemas.microsoft.com/office/drawing/2014/chartex" xmlns:cx1="http://schemas.microsoft.com/office/drawing/2015/9/8/chartex" xmlns:cx2="http://schemas.microsoft.com/office/drawing/2015/10/21/chartex" xmlns:cx3="http://schemas.microsoft.com/office/drawing/2016/5/9/chartex" xmlns:cx4="http://schemas.microsoft.com/office/drawing/2016/5/10/chartex" xmlns:cx5="http://schemas.microsoft.com/office/drawing/2016/5/11/chartex" xmlns:cx6="http://schemas.microsoft.com/office/drawing/2016/5/12/chartex" xmlns:cx7="http://schemas.microsoft.com/office/drawing/2016/5/13/chartex" xmlns:cx8="http://schemas.microsoft.com/office/drawing/2016/5/14/chartex" xmlns:mc="http://schemas.openxmlformats.org/markup-compatibility/2006" xmlns:aink="http://schemas.microsoft.com/office/drawing/2016/ink" xmlns:am3d="http://schemas.microsoft.com/office/drawing/2017/model3d" xmlns:o="urn:schemas-microsoft-com:office:office" xmlns:oel="http://schemas.microsoft.com/office/2019/extlst" xmlns:r="http://schemas.openxmlformats.org/officeDocument/2006/relationships" xmlns:m="http://schemas.openxmlformats.org/officeDocument/2006/math" xmlns:v="urn:schemas-microsoft-com:vml" xmlns:wp14="http://schemas.microsoft.com/office/word/2010/wordprocessingDrawing" xmlns:wp="http://schemas.openxmlformats.org/drawingml/2006/wordprocessingDrawing" xmlns:w10="urn:schemas-microsoft-com:office:word" xmlns:w="http://schemas.openxmlformats.org/wordprocessingml/2006/main" xmlns:w14="http://schemas.microsoft.com/office/word/2010/wordml" xmlns:w15="http://schemas.microsoft.com/office/word/2012/wordml" xmlns:w16cex="http://schemas.microsoft.com/office/word/2018/wordml/cex" xmlns:w16cid="http://schemas.microsoft.com/office/word/2016/wordml/cid" xmlns:w16="http://schemas.microsoft.com/office/word/2018/wordml" xmlns:w16du="http://schemas.microsoft.com/office/word/2023/wordml/word16du" xmlns:w16sdtdh="http://schemas.microsoft.com/office/word/2020/wordml/sdtdatahash" xmlns:w16sdtfl="http://schemas.microsoft.com/office/word/2024/wordml/sdtformatlock" xmlns:w16se="http://schemas.microsoft.com/office/word/2015/wordml/symex" xmlns:wpg="http://schemas.microsoft.com/office/word/2010/wordprocessingGroup" xmlns:wpi="http://schemas.microsoft.com/office/word/2010/wordprocessingInk" xmlns:wne="http://schemas.microsoft.com/office/word/2006/wordml" xmlns:wps="http://schemas.microsoft.com/office/word/2010/wordprocessingShape" mc:Ignorable="w14 w15 w16se w16cid w16 w16cex w16sdtdh w16sdtfl w16du wp14">
   <w:body>
     <w:tbl>
       <w:tblPr>
@@ -44,39 +44,47 @@
                 <w:color w:val="000000"/>
               </w:rPr>
               <w:drawing>
-                <wp:inline distT="0" distB="0" distL="0" distR="0" wp14:anchorId="4E42E611" wp14:editId="6FF366A2">
-                  <wp:extent cx="861060" cy="861060"/>
+                <wp:inline distT="0" distB="0" distL="0" distR="0" wp14:anchorId="60A8BCF9" wp14:editId="4466988A">
+                  <wp:extent cx="975360" cy="975360"/>
                   <wp:effectExtent l="0" t="0" r="0" b="0"/>
-                  <wp:docPr id="7" name="image2.jpg"/>
-                  <wp:cNvGraphicFramePr/>
+                  <wp:docPr id="4" name="Imagem 4"/>
+                  <wp:cNvGraphicFramePr>
+                    <a:graphicFrameLocks xmlns:a="http://schemas.openxmlformats.org/drawingml/2006/main" noChangeAspect="1"/>
+                  </wp:cNvGraphicFramePr>
                   <a:graphic xmlns:a="http://schemas.openxmlformats.org/drawingml/2006/main">
                     <a:graphicData uri="http://schemas.openxmlformats.org/drawingml/2006/picture">
                       <pic:pic xmlns:pic="http://schemas.openxmlformats.org/drawingml/2006/picture">
                         <pic:nvPicPr>
-                          <pic:cNvPr id="7" name="image2.jpg"/>
-                          <pic:cNvPicPr preferRelativeResize="0"/>
+                          <pic:cNvPr id="0" name="Picture 1"/>
+                          <pic:cNvPicPr>
+                            <a:picLocks noChangeAspect="1" noChangeArrowheads="1"/>
+                          </pic:cNvPicPr>
                         </pic:nvPicPr>
                         <pic:blipFill>
-                          <a:blip r:embed="rId7">
+                          <a:blip r:embed="rId7" cstate="print">
                             <a:extLst>
                               <a:ext uri="{28A0092B-C50C-407E-A947-70E740481C1C}">
                                 <a14:useLocalDpi xmlns:a14="http://schemas.microsoft.com/office/drawing/2010/main" val="0"/>
                               </a:ext>
                             </a:extLst>
                           </a:blip>
+                          <a:srcRect/>
                           <a:stretch>
                             <a:fillRect/>
                           </a:stretch>
                         </pic:blipFill>
-                        <pic:spPr>
+                        <pic:spPr bwMode="auto">
                           <a:xfrm>
                             <a:off x="0" y="0"/>
-                            <a:ext cx="861060" cy="861060"/>
+                            <a:ext cx="975360" cy="975360"/>
                           </a:xfrm>
                           <a:prstGeom prst="rect">
                             <a:avLst/>
                           </a:prstGeom>
-                          <a:ln/>
+                          <a:noFill/>
+                          <a:ln>
+                            <a:noFill/>
+                          </a:ln>
                         </pic:spPr>
                       </pic:pic>
                     </a:graphicData>
@@ -101,15 +109,18 @@
           <w:p>
             <w:pPr>
               <w:widowControl w:val="0"/>
+              <w:spacing w:line="276" w:lineRule="auto"/>
               <w:rPr>
                 <w:b/>
                 <w:color w:val="auto"/>
+                <w:highlight w:val="white"/>
               </w:rPr>
             </w:pPr>
             <w:r>
               <w:rPr>
                 <w:b/>
                 <w:color w:val="auto"/>
+                <w:highlight w:val="white"/>
               </w:rPr>
               <w:t>VISACUT COMERCIO DE MAQUINAS EIRELI</w:t>
             </w:r>
@@ -121,8 +132,6 @@
               <w:rPr>
                 <w:b/>
                 <w:color w:val="auto"/>
-                <w:sz w:val="18"/>
-                <w:szCs w:val="18"/>
                 <w:highlight w:val="white"/>
               </w:rPr>
             </w:pPr>
@@ -130,6 +139,7 @@
               <w:rPr>
                 <w:b/>
                 <w:color w:val="auto"/>
+                <w:highlight w:val="white"/>
               </w:rPr>
               <w:t>CNPJ: 26.715.677/000108 – MATRIZ SP</w:t>
             </w:r>
@@ -150,25 +160,7 @@
                 <w:sz w:val="18"/>
                 <w:szCs w:val="18"/>
               </w:rPr>
-              <w:t xml:space="preserve">Rua Reinaldo </w:t>
-            </w:r>
-            <w:proofErr w:type="spellStart"/>
-            <w:r>
-              <w:rPr>
-                <w:i/>
-                <w:sz w:val="18"/>
-                <w:szCs w:val="18"/>
-              </w:rPr>
-              <w:t>Raulino</w:t>
-            </w:r>
-            <w:proofErr w:type="spellEnd"/>
-            <w:r>
-              <w:rPr>
-                <w:i/>
-                <w:sz w:val="18"/>
-                <w:szCs w:val="18"/>
-              </w:rPr>
-              <w:t xml:space="preserve"> dos Santos, 79</w:t>
+              <w:t>Rua Reinaldo Raulino dos Santos, 79</w:t>
             </w:r>
           </w:p>
           <w:p>
@@ -269,7 +261,10 @@
               <w:t xml:space="preserve"> </w:t>
             </w:r>
             <w:r>
-              <w:t>##OSCodigo##</w:t>
+              <w:rPr>
+                <w:highlight w:val="white"/>
+              </w:rPr>
+              <w:t>##Pedido##</w:t>
             </w:r>
           </w:p>
         </w:tc>
@@ -346,7 +341,10 @@
               <w:t xml:space="preserve">Emissão </w:t>
             </w:r>
             <w:r>
-              <w:t>##OsDataAbertura##</w:t>
+              <w:rPr>
+                <w:highlight w:val="white"/>
+              </w:rPr>
+              <w:t>##DataEmissao##</w:t>
             </w:r>
           </w:p>
         </w:tc>
@@ -419,6 +417,21 @@
                 <w:highlight w:val="white"/>
               </w:rPr>
             </w:pPr>
+            <w:r>
+              <w:rPr>
+                <w:b/>
+                <w:sz w:val="18"/>
+                <w:szCs w:val="18"/>
+                <w:highlight w:val="white"/>
+              </w:rPr>
+              <w:t xml:space="preserve">Validade </w:t>
+            </w:r>
+            <w:r>
+              <w:rPr>
+                <w:highlight w:val="white"/>
+              </w:rPr>
+              <w:t>##ValidadeDoOrcamento##</w:t>
+            </w:r>
           </w:p>
         </w:tc>
       </w:tr>
@@ -427,6 +440,67 @@
       <w:pPr>
         <w:spacing w:after="0"/>
         <w:jc w:val="center"/>
+      </w:pPr>
+      <w:r>
+        <w:rPr>
+          <w:b/>
+          <w:color w:val="000000"/>
+          <w:sz w:val="22"/>
+          <w:szCs w:val="22"/>
+        </w:rPr>
+        <w:t>Vendedor(a):</w:t>
+      </w:r>
+      <w:r>
+        <w:rPr>
+          <w:b/>
+          <w:color w:val="000000"/>
+          <w:sz w:val="22"/>
+          <w:szCs w:val="22"/>
+        </w:rPr>
+        <w:tab/>
+      </w:r>
+      <w:r>
+        <w:t>##NomeDoVendedor##</w:t>
+      </w:r>
+      <w:r>
+        <w:rPr>
+          <w:b/>
+          <w:color w:val="000000"/>
+          <w:sz w:val="22"/>
+          <w:szCs w:val="22"/>
+        </w:rPr>
+        <w:tab/>
+      </w:r>
+      <w:r>
+        <w:rPr>
+          <w:b/>
+          <w:color w:val="000000"/>
+          <w:sz w:val="22"/>
+          <w:szCs w:val="22"/>
+        </w:rPr>
+        <w:tab/>
+        <w:t xml:space="preserve">                 Email</w:t>
+      </w:r>
+      <w:r>
+        <w:t>:</w:t>
+      </w:r>
+      <w:r>
+        <w:t xml:space="preserve"> </w:t>
+      </w:r>
+      <w:r>
+        <w:t>##VendedorEmail##</w:t>
+      </w:r>
+    </w:p>
+    <w:p>
+      <w:pPr>
+        <w:spacing w:after="0"/>
+        <w:jc w:val="center"/>
+        <w:rPr>
+          <w:b/>
+          <w:color w:val="000000"/>
+          <w:sz w:val="22"/>
+          <w:szCs w:val="22"/>
+        </w:rPr>
       </w:pPr>
     </w:p>
     <w:p>
@@ -447,7 +521,52 @@
           <w:sz w:val="24"/>
           <w:szCs w:val="24"/>
         </w:rPr>
-        <w:t>DADOS DO CHAMADO/ ORDEM DE SERVIÇO</w:t>
+        <w:t xml:space="preserve">DADOS </w:t>
+      </w:r>
+      <w:r>
+        <w:rPr>
+          <w:b/>
+          <w:color w:val="000000"/>
+          <w:sz w:val="24"/>
+          <w:szCs w:val="24"/>
+        </w:rPr>
+        <w:t>DO CHAM</w:t>
+      </w:r>
+      <w:r>
+        <w:rPr>
+          <w:b/>
+          <w:color w:val="000000"/>
+          <w:sz w:val="24"/>
+          <w:szCs w:val="24"/>
+        </w:rPr>
+        <w:t>A</w:t>
+      </w:r>
+      <w:r>
+        <w:rPr>
+          <w:b/>
+          <w:color w:val="000000"/>
+          <w:sz w:val="24"/>
+          <w:szCs w:val="24"/>
+        </w:rPr>
+        <w:t>DO/</w:t>
+      </w:r>
+      <w:r>
+        <w:rPr>
+          <w:b/>
+          <w:color w:val="000000"/>
+          <w:sz w:val="24"/>
+          <w:szCs w:val="24"/>
+        </w:rPr>
+        <w:t xml:space="preserve"> </w:t>
+      </w:r>
+      <w:r>
+        <w:rPr>
+          <w:b/>
+          <w:color w:val="000000"/>
+          <w:sz w:val="24"/>
+          <w:szCs w:val="24"/>
+        </w:rPr>
+        <w:t>ORDEM DE SERVIÇO</w:t>
       </w:r>
     </w:p>
     <w:tbl>
@@ -533,6 +652,7 @@
                 <w:color w:val="000000"/>
                 <w:sz w:val="24"/>
                 <w:szCs w:val="24"/>
+                <w:u w:val="single"/>
               </w:rPr>
             </w:pPr>
             <w:r>
@@ -812,7 +932,6 @@
     <w:p>
       <w:pPr>
         <w:spacing w:after="0" w:line="240" w:lineRule="auto"/>
-        <w:jc w:val="center"/>
         <w:rPr>
           <w:b/>
           <w:sz w:val="24"/>
@@ -1359,7 +1478,7 @@
                 <w:rFonts w:asciiTheme="majorHAnsi" w:hAnsiTheme="majorHAnsi" w:cstheme="majorHAnsi"/>
                 <w:shd w:val="clear" w:color="auto" w:fill="FFFFFF"/>
               </w:rPr>
-              <w:t>##CodigoServico##</w:t>
+              <w:t>##CodigoProduto##</w:t>
             </w:r>
           </w:p>
         </w:tc>
@@ -1381,7 +1500,7 @@
                 <w:rFonts w:asciiTheme="majorHAnsi" w:hAnsiTheme="majorHAnsi" w:cstheme="majorHAnsi"/>
                 <w:shd w:val="clear" w:color="auto" w:fill="FFFFFF"/>
               </w:rPr>
-              <w:t>##DescricaoServico##</w:t>
+              <w:t>##DescricaoProduto##</w:t>
             </w:r>
           </w:p>
         </w:tc>
@@ -1444,108 +1563,18 @@
           </w:tcPr>
           <w:p>
             <w:pPr>
-              <w:jc w:val="center"/>
-              <w:rPr>
-                <w:b/>
-                <w:sz w:val="24"/>
-                <w:szCs w:val="24"/>
-              </w:rPr>
-            </w:pPr>
-            <w:r>
               <w:rPr>
                 <w:rFonts w:ascii="Helvetica" w:hAnsi="Helvetica" w:cs="Helvetica"/>
                 <w:shd w:val="clear" w:color="auto" w:fill="FFFFFF"/>
               </w:rPr>
-              <w:t> </w:t>
-            </w:r>
-          </w:p>
-        </w:tc>
-      </w:tr>
-      <w:tr>
-        <w:tc>
-          <w:tcPr>
-            <w:tcW w:w="11188" w:type="dxa"/>
-            <w:tcBorders>
-              <w:top w:val="single" w:sz="4" w:space="0" w:color="auto"/>
-              <w:left w:val="single" w:sz="4" w:space="0" w:color="auto"/>
-              <w:bottom w:val="single" w:sz="4" w:space="0" w:color="auto"/>
-              <w:right w:val="single" w:sz="4" w:space="0" w:color="auto"/>
-            </w:tcBorders>
-          </w:tcPr>
-          <w:p>
-            <w:pPr>
-              <w:jc w:val="center"/>
+            </w:pPr>
+            <w:r>
               <w:rPr>
                 <w:rFonts w:ascii="Helvetica" w:hAnsi="Helvetica" w:cs="Helvetica"/>
                 <w:shd w:val="clear" w:color="auto" w:fill="FFFFFF"/>
               </w:rPr>
-            </w:pPr>
-          </w:p>
-        </w:tc>
-      </w:tr>
-      <w:tr>
-        <w:tc>
-          <w:tcPr>
-            <w:tcW w:w="11188" w:type="dxa"/>
-            <w:tcBorders>
-              <w:top w:val="single" w:sz="4" w:space="0" w:color="auto"/>
-              <w:left w:val="single" w:sz="4" w:space="0" w:color="auto"/>
-              <w:bottom w:val="single" w:sz="4" w:space="0" w:color="auto"/>
-              <w:right w:val="single" w:sz="4" w:space="0" w:color="auto"/>
-            </w:tcBorders>
-          </w:tcPr>
-          <w:p>
-            <w:pPr>
-              <w:jc w:val="center"/>
-              <w:rPr>
-                <w:rFonts w:ascii="Helvetica" w:hAnsi="Helvetica" w:cs="Helvetica"/>
-                <w:shd w:val="clear" w:color="auto" w:fill="FFFFFF"/>
-              </w:rPr>
-            </w:pPr>
-          </w:p>
-        </w:tc>
-      </w:tr>
-      <w:tr>
-        <w:tc>
-          <w:tcPr>
-            <w:tcW w:w="11188" w:type="dxa"/>
-            <w:tcBorders>
-              <w:top w:val="single" w:sz="4" w:space="0" w:color="auto"/>
-              <w:left w:val="single" w:sz="4" w:space="0" w:color="auto"/>
-              <w:bottom w:val="single" w:sz="4" w:space="0" w:color="auto"/>
-              <w:right w:val="single" w:sz="4" w:space="0" w:color="auto"/>
-            </w:tcBorders>
-          </w:tcPr>
-          <w:p>
-            <w:pPr>
-              <w:jc w:val="center"/>
-              <w:rPr>
-                <w:rFonts w:ascii="Helvetica" w:hAnsi="Helvetica" w:cs="Helvetica"/>
-                <w:shd w:val="clear" w:color="auto" w:fill="FFFFFF"/>
-              </w:rPr>
-            </w:pPr>
-          </w:p>
-        </w:tc>
-      </w:tr>
-      <w:tr>
-        <w:tc>
-          <w:tcPr>
-            <w:tcW w:w="11188" w:type="dxa"/>
-            <w:tcBorders>
-              <w:top w:val="single" w:sz="4" w:space="0" w:color="auto"/>
-              <w:left w:val="single" w:sz="4" w:space="0" w:color="auto"/>
-              <w:bottom w:val="single" w:sz="4" w:space="0" w:color="auto"/>
-              <w:right w:val="single" w:sz="4" w:space="0" w:color="auto"/>
-            </w:tcBorders>
-          </w:tcPr>
-          <w:p>
-            <w:pPr>
-              <w:jc w:val="center"/>
-              <w:rPr>
-                <w:rFonts w:ascii="Helvetica" w:hAnsi="Helvetica" w:cs="Helvetica"/>
-                <w:shd w:val="clear" w:color="auto" w:fill="FFFFFF"/>
-              </w:rPr>
-            </w:pPr>
+              <w:t>##CosideracoesDoTecnico##</w:t>
+            </w:r>
           </w:p>
         </w:tc>
       </w:tr>
@@ -1697,6 +1726,14 @@
               </w:rPr>
               <w:t> </w:t>
             </w:r>
+            <w:r>
+              <w:rPr>
+                <w:rFonts w:ascii="ArialNormal" w:eastAsia="Times New Roman" w:hAnsi="ArialNormal"/>
+                <w:sz w:val="18"/>
+                <w:szCs w:val="18"/>
+              </w:rPr>
+              <w:t>##AssinaturaTecnico##</w:t>
+            </w:r>
           </w:p>
         </w:tc>
         <w:tc>
@@ -1834,6 +1871,14 @@
                 <w:szCs w:val="18"/>
               </w:rPr>
               <w:t> </w:t>
+            </w:r>
+            <w:r>
+              <w:rPr>
+                <w:rFonts w:ascii="ArialNormal" w:eastAsia="Times New Roman" w:hAnsi="ArialNormal"/>
+                <w:sz w:val="18"/>
+                <w:szCs w:val="18"/>
+              </w:rPr>
+              <w:t>##AssinaturaCliente##</w:t>
             </w:r>
           </w:p>
         </w:tc>
@@ -2036,6 +2081,13 @@
     </w:p>
     <w:p>
       <w:pPr>
+        <w:pBdr>
+          <w:top w:val="nil"/>
+          <w:left w:val="nil"/>
+          <w:bottom w:val="nil"/>
+          <w:right w:val="nil"/>
+          <w:between w:val="nil"/>
+        </w:pBdr>
         <w:spacing w:after="0" w:line="240" w:lineRule="auto"/>
       </w:pPr>
     </w:p>
@@ -2056,7 +2108,7 @@
 </file>
 
 <file path=word/endnotes.xml><?xml version="1.0" encoding="utf-8"?>
-<w:endnotes xmlns:wpc="http://schemas.microsoft.com/office/word/2010/wordprocessingCanvas" xmlns:cx="http://schemas.microsoft.com/office/drawing/2014/chartex" xmlns:cx1="http://schemas.microsoft.com/office/drawing/2015/9/8/chartex" xmlns:cx2="http://schemas.microsoft.com/office/drawing/2015/10/21/chartex" xmlns:cx3="http://schemas.microsoft.com/office/drawing/2016/5/9/chartex" xmlns:cx4="http://schemas.microsoft.com/office/drawing/2016/5/10/chartex" xmlns:cx5="http://schemas.microsoft.com/office/drawing/2016/5/11/chartex" xmlns:cx6="http://schemas.microsoft.com/office/drawing/2016/5/12/chartex" xmlns:cx7="http://schemas.microsoft.com/office/drawing/2016/5/13/chartex" xmlns:cx8="http://schemas.microsoft.com/office/drawing/2016/5/14/chartex" xmlns:mc="http://schemas.openxmlformats.org/markup-compatibility/2006" xmlns:aink="http://schemas.microsoft.com/office/drawing/2016/ink" xmlns:am3d="http://schemas.microsoft.com/office/drawing/2017/model3d" xmlns:o="urn:schemas-microsoft-com:office:office" xmlns:oel="http://schemas.microsoft.com/office/2019/extlst" xmlns:r="http://schemas.openxmlformats.org/officeDocument/2006/relationships" xmlns:m="http://schemas.openxmlformats.org/officeDocument/2006/math" xmlns:v="urn:schemas-microsoft-com:vml" xmlns:wp14="http://schemas.microsoft.com/office/word/2010/wordprocessingDrawing" xmlns:wp="http://schemas.openxmlformats.org/drawingml/2006/wordprocessingDrawing" xmlns:w10="urn:schemas-microsoft-com:office:word" xmlns:w="http://schemas.openxmlformats.org/wordprocessingml/2006/main" xmlns:w14="http://schemas.microsoft.com/office/word/2010/wordml" xmlns:w15="http://schemas.microsoft.com/office/word/2012/wordml" xmlns:w16cex="http://schemas.microsoft.com/office/word/2018/wordml/cex" xmlns:w16cid="http://schemas.microsoft.com/office/word/2016/wordml/cid" xmlns:w16="http://schemas.microsoft.com/office/word/2018/wordml" xmlns:w16sdtdh="http://schemas.microsoft.com/office/word/2020/wordml/sdtdatahash" xmlns:w16se="http://schemas.microsoft.com/office/word/2015/wordml/symex" xmlns:wpg="http://schemas.microsoft.com/office/word/2010/wordprocessingGroup" xmlns:wpi="http://schemas.microsoft.com/office/word/2010/wordprocessingInk" xmlns:wne="http://schemas.microsoft.com/office/word/2006/wordml" xmlns:wps="http://schemas.microsoft.com/office/word/2010/wordprocessingShape" mc:Ignorable="w14 w15 w16se w16cid w16 w16cex w16sdtdh wp14">
+<w:endnotes xmlns:wpc="http://schemas.microsoft.com/office/word/2010/wordprocessingCanvas" xmlns:cx="http://schemas.microsoft.com/office/drawing/2014/chartex" xmlns:cx1="http://schemas.microsoft.com/office/drawing/2015/9/8/chartex" xmlns:cx2="http://schemas.microsoft.com/office/drawing/2015/10/21/chartex" xmlns:cx3="http://schemas.microsoft.com/office/drawing/2016/5/9/chartex" xmlns:cx4="http://schemas.microsoft.com/office/drawing/2016/5/10/chartex" xmlns:cx5="http://schemas.microsoft.com/office/drawing/2016/5/11/chartex" xmlns:cx6="http://schemas.microsoft.com/office/drawing/2016/5/12/chartex" xmlns:cx7="http://schemas.microsoft.com/office/drawing/2016/5/13/chartex" xmlns:cx8="http://schemas.microsoft.com/office/drawing/2016/5/14/chartex" xmlns:mc="http://schemas.openxmlformats.org/markup-compatibility/2006" xmlns:aink="http://schemas.microsoft.com/office/drawing/2016/ink" xmlns:am3d="http://schemas.microsoft.com/office/drawing/2017/model3d" xmlns:o="urn:schemas-microsoft-com:office:office" xmlns:oel="http://schemas.microsoft.com/office/2019/extlst" xmlns:r="http://schemas.openxmlformats.org/officeDocument/2006/relationships" xmlns:m="http://schemas.openxmlformats.org/officeDocument/2006/math" xmlns:v="urn:schemas-microsoft-com:vml" xmlns:wp14="http://schemas.microsoft.com/office/word/2010/wordprocessingDrawing" xmlns:wp="http://schemas.openxmlformats.org/drawingml/2006/wordprocessingDrawing" xmlns:w10="urn:schemas-microsoft-com:office:word" xmlns:w="http://schemas.openxmlformats.org/wordprocessingml/2006/main" xmlns:w14="http://schemas.microsoft.com/office/word/2010/wordml" xmlns:w15="http://schemas.microsoft.com/office/word/2012/wordml" xmlns:w16cex="http://schemas.microsoft.com/office/word/2018/wordml/cex" xmlns:w16cid="http://schemas.microsoft.com/office/word/2016/wordml/cid" xmlns:w16="http://schemas.microsoft.com/office/word/2018/wordml" xmlns:w16du="http://schemas.microsoft.com/office/word/2023/wordml/word16du" xmlns:w16sdtdh="http://schemas.microsoft.com/office/word/2020/wordml/sdtdatahash" xmlns:w16sdtfl="http://schemas.microsoft.com/office/word/2024/wordml/sdtformatlock" xmlns:w16se="http://schemas.microsoft.com/office/word/2015/wordml/symex" xmlns:wpg="http://schemas.microsoft.com/office/word/2010/wordprocessingGroup" xmlns:wpi="http://schemas.microsoft.com/office/word/2010/wordprocessingInk" xmlns:wne="http://schemas.microsoft.com/office/word/2006/wordml" xmlns:wps="http://schemas.microsoft.com/office/word/2010/wordprocessingShape" mc:Ignorable="w14 w15 w16se w16cid w16 w16cex w16sdtdh w16sdtfl w16du wp14">
   <w:endnote w:type="separator" w:id="-1">
     <w:p>
       <w:pPr>
@@ -2081,7 +2133,7 @@
 </file>
 
 <file path=word/footer1.xml><?xml version="1.0" encoding="utf-8"?>
-<w:ftr xmlns:wpc="http://schemas.microsoft.com/office/word/2010/wordprocessingCanvas" xmlns:cx="http://schemas.microsoft.com/office/drawing/2014/chartex" xmlns:cx1="http://schemas.microsoft.com/office/drawing/2015/9/8/chartex" xmlns:cx2="http://schemas.microsoft.com/office/drawing/2015/10/21/chartex" xmlns:cx3="http://schemas.microsoft.com/office/drawing/2016/5/9/chartex" xmlns:cx4="http://schemas.microsoft.com/office/drawing/2016/5/10/chartex" xmlns:cx5="http://schemas.microsoft.com/office/drawing/2016/5/11/chartex" xmlns:cx6="http://schemas.microsoft.com/office/drawing/2016/5/12/chartex" xmlns:cx7="http://schemas.microsoft.com/office/drawing/2016/5/13/chartex" xmlns:cx8="http://schemas.microsoft.com/office/drawing/2016/5/14/chartex" xmlns:mc="http://schemas.openxmlformats.org/markup-compatibility/2006" xmlns:aink="http://schemas.microsoft.com/office/drawing/2016/ink" xmlns:am3d="http://schemas.microsoft.com/office/drawing/2017/model3d" xmlns:o="urn:schemas-microsoft-com:office:office" xmlns:oel="http://schemas.microsoft.com/office/2019/extlst" xmlns:r="http://schemas.openxmlformats.org/officeDocument/2006/relationships" xmlns:m="http://schemas.openxmlformats.org/officeDocument/2006/math" xmlns:v="urn:schemas-microsoft-com:vml" xmlns:wp14="http://schemas.microsoft.com/office/word/2010/wordprocessingDrawing" xmlns:wp="http://schemas.openxmlformats.org/drawingml/2006/wordprocessingDrawing" xmlns:w10="urn:schemas-microsoft-com:office:word" xmlns:w="http://schemas.openxmlformats.org/wordprocessingml/2006/main" xmlns:w14="http://schemas.microsoft.com/office/word/2010/wordml" xmlns:w15="http://schemas.microsoft.com/office/word/2012/wordml" xmlns:w16cex="http://schemas.microsoft.com/office/word/2018/wordml/cex" xmlns:w16cid="http://schemas.microsoft.com/office/word/2016/wordml/cid" xmlns:w16="http://schemas.microsoft.com/office/word/2018/wordml" xmlns:w16sdtdh="http://schemas.microsoft.com/office/word/2020/wordml/sdtdatahash" xmlns:w16se="http://schemas.microsoft.com/office/word/2015/wordml/symex" xmlns:wpg="http://schemas.microsoft.com/office/word/2010/wordprocessingGroup" xmlns:wpi="http://schemas.microsoft.com/office/word/2010/wordprocessingInk" xmlns:wne="http://schemas.microsoft.com/office/word/2006/wordml" xmlns:wps="http://schemas.microsoft.com/office/word/2010/wordprocessingShape" mc:Ignorable="w14 w15 w16se w16cid w16 w16cex w16sdtdh wp14">
+<w:ftr xmlns:wpc="http://schemas.microsoft.com/office/word/2010/wordprocessingCanvas" xmlns:cx="http://schemas.microsoft.com/office/drawing/2014/chartex" xmlns:cx1="http://schemas.microsoft.com/office/drawing/2015/9/8/chartex" xmlns:cx2="http://schemas.microsoft.com/office/drawing/2015/10/21/chartex" xmlns:cx3="http://schemas.microsoft.com/office/drawing/2016/5/9/chartex" xmlns:cx4="http://schemas.microsoft.com/office/drawing/2016/5/10/chartex" xmlns:cx5="http://schemas.microsoft.com/office/drawing/2016/5/11/chartex" xmlns:cx6="http://schemas.microsoft.com/office/drawing/2016/5/12/chartex" xmlns:cx7="http://schemas.microsoft.com/office/drawing/2016/5/13/chartex" xmlns:cx8="http://schemas.microsoft.com/office/drawing/2016/5/14/chartex" xmlns:mc="http://schemas.openxmlformats.org/markup-compatibility/2006" xmlns:aink="http://schemas.microsoft.com/office/drawing/2016/ink" xmlns:am3d="http://schemas.microsoft.com/office/drawing/2017/model3d" xmlns:o="urn:schemas-microsoft-com:office:office" xmlns:oel="http://schemas.microsoft.com/office/2019/extlst" xmlns:r="http://schemas.openxmlformats.org/officeDocument/2006/relationships" xmlns:m="http://schemas.openxmlformats.org/officeDocument/2006/math" xmlns:v="urn:schemas-microsoft-com:vml" xmlns:wp14="http://schemas.microsoft.com/office/word/2010/wordprocessingDrawing" xmlns:wp="http://schemas.openxmlformats.org/drawingml/2006/wordprocessingDrawing" xmlns:w10="urn:schemas-microsoft-com:office:word" xmlns:w="http://schemas.openxmlformats.org/wordprocessingml/2006/main" xmlns:w14="http://schemas.microsoft.com/office/word/2010/wordml" xmlns:w15="http://schemas.microsoft.com/office/word/2012/wordml" xmlns:w16cex="http://schemas.microsoft.com/office/word/2018/wordml/cex" xmlns:w16cid="http://schemas.microsoft.com/office/word/2016/wordml/cid" xmlns:w16="http://schemas.microsoft.com/office/word/2018/wordml" xmlns:w16du="http://schemas.microsoft.com/office/word/2023/wordml/word16du" xmlns:w16sdtdh="http://schemas.microsoft.com/office/word/2020/wordml/sdtdatahash" xmlns:w16sdtfl="http://schemas.microsoft.com/office/word/2024/wordml/sdtformatlock" xmlns:w16se="http://schemas.microsoft.com/office/word/2015/wordml/symex" xmlns:wpg="http://schemas.microsoft.com/office/word/2010/wordprocessingGroup" xmlns:wpi="http://schemas.microsoft.com/office/word/2010/wordprocessingInk" xmlns:wne="http://schemas.microsoft.com/office/word/2006/wordml" xmlns:wps="http://schemas.microsoft.com/office/word/2010/wordprocessingShape" mc:Ignorable="w14 w15 w16se w16cid w16 w16cex w16sdtdh w16sdtfl w16du wp14">
   <w:p>
     <w:pPr>
       <w:pBdr>
@@ -2102,7 +2154,7 @@
 </file>
 
 <file path=word/footer2.xml><?xml version="1.0" encoding="utf-8"?>
-<w:ftr xmlns:wpc="http://schemas.microsoft.com/office/word/2010/wordprocessingCanvas" xmlns:cx="http://schemas.microsoft.com/office/drawing/2014/chartex" xmlns:cx1="http://schemas.microsoft.com/office/drawing/2015/9/8/chartex" xmlns:cx2="http://schemas.microsoft.com/office/drawing/2015/10/21/chartex" xmlns:cx3="http://schemas.microsoft.com/office/drawing/2016/5/9/chartex" xmlns:cx4="http://schemas.microsoft.com/office/drawing/2016/5/10/chartex" xmlns:cx5="http://schemas.microsoft.com/office/drawing/2016/5/11/chartex" xmlns:cx6="http://schemas.microsoft.com/office/drawing/2016/5/12/chartex" xmlns:cx7="http://schemas.microsoft.com/office/drawing/2016/5/13/chartex" xmlns:cx8="http://schemas.microsoft.com/office/drawing/2016/5/14/chartex" xmlns:mc="http://schemas.openxmlformats.org/markup-compatibility/2006" xmlns:aink="http://schemas.microsoft.com/office/drawing/2016/ink" xmlns:am3d="http://schemas.microsoft.com/office/drawing/2017/model3d" xmlns:o="urn:schemas-microsoft-com:office:office" xmlns:oel="http://schemas.microsoft.com/office/2019/extlst" xmlns:r="http://schemas.openxmlformats.org/officeDocument/2006/relationships" xmlns:m="http://schemas.openxmlformats.org/officeDocument/2006/math" xmlns:v="urn:schemas-microsoft-com:vml" xmlns:wp14="http://schemas.microsoft.com/office/word/2010/wordprocessingDrawing" xmlns:wp="http://schemas.openxmlformats.org/drawingml/2006/wordprocessingDrawing" xmlns:w10="urn:schemas-microsoft-com:office:word" xmlns:w="http://schemas.openxmlformats.org/wordprocessingml/2006/main" xmlns:w14="http://schemas.microsoft.com/office/word/2010/wordml" xmlns:w15="http://schemas.microsoft.com/office/word/2012/wordml" xmlns:w16cex="http://schemas.microsoft.com/office/word/2018/wordml/cex" xmlns:w16cid="http://schemas.microsoft.com/office/word/2016/wordml/cid" xmlns:w16="http://schemas.microsoft.com/office/word/2018/wordml" xmlns:w16sdtdh="http://schemas.microsoft.com/office/word/2020/wordml/sdtdatahash" xmlns:w16se="http://schemas.microsoft.com/office/word/2015/wordml/symex" xmlns:wpg="http://schemas.microsoft.com/office/word/2010/wordprocessingGroup" xmlns:wpi="http://schemas.microsoft.com/office/word/2010/wordprocessingInk" xmlns:wne="http://schemas.microsoft.com/office/word/2006/wordml" xmlns:wps="http://schemas.microsoft.com/office/word/2010/wordprocessingShape" mc:Ignorable="w14 w15 w16se w16cid w16 w16cex w16sdtdh wp14">
+<w:ftr xmlns:wpc="http://schemas.microsoft.com/office/word/2010/wordprocessingCanvas" xmlns:cx="http://schemas.microsoft.com/office/drawing/2014/chartex" xmlns:cx1="http://schemas.microsoft.com/office/drawing/2015/9/8/chartex" xmlns:cx2="http://schemas.microsoft.com/office/drawing/2015/10/21/chartex" xmlns:cx3="http://schemas.microsoft.com/office/drawing/2016/5/9/chartex" xmlns:cx4="http://schemas.microsoft.com/office/drawing/2016/5/10/chartex" xmlns:cx5="http://schemas.microsoft.com/office/drawing/2016/5/11/chartex" xmlns:cx6="http://schemas.microsoft.com/office/drawing/2016/5/12/chartex" xmlns:cx7="http://schemas.microsoft.com/office/drawing/2016/5/13/chartex" xmlns:cx8="http://schemas.microsoft.com/office/drawing/2016/5/14/chartex" xmlns:mc="http://schemas.openxmlformats.org/markup-compatibility/2006" xmlns:aink="http://schemas.microsoft.com/office/drawing/2016/ink" xmlns:am3d="http://schemas.microsoft.com/office/drawing/2017/model3d" xmlns:o="urn:schemas-microsoft-com:office:office" xmlns:oel="http://schemas.microsoft.com/office/2019/extlst" xmlns:r="http://schemas.openxmlformats.org/officeDocument/2006/relationships" xmlns:m="http://schemas.openxmlformats.org/officeDocument/2006/math" xmlns:v="urn:schemas-microsoft-com:vml" xmlns:wp14="http://schemas.microsoft.com/office/word/2010/wordprocessingDrawing" xmlns:wp="http://schemas.openxmlformats.org/drawingml/2006/wordprocessingDrawing" xmlns:w10="urn:schemas-microsoft-com:office:word" xmlns:w="http://schemas.openxmlformats.org/wordprocessingml/2006/main" xmlns:w14="http://schemas.microsoft.com/office/word/2010/wordml" xmlns:w15="http://schemas.microsoft.com/office/word/2012/wordml" xmlns:w16cex="http://schemas.microsoft.com/office/word/2018/wordml/cex" xmlns:w16cid="http://schemas.microsoft.com/office/word/2016/wordml/cid" xmlns:w16="http://schemas.microsoft.com/office/word/2018/wordml" xmlns:w16du="http://schemas.microsoft.com/office/word/2023/wordml/word16du" xmlns:w16sdtdh="http://schemas.microsoft.com/office/word/2020/wordml/sdtdatahash" xmlns:w16sdtfl="http://schemas.microsoft.com/office/word/2024/wordml/sdtformatlock" xmlns:w16se="http://schemas.microsoft.com/office/word/2015/wordml/symex" xmlns:wpg="http://schemas.microsoft.com/office/word/2010/wordprocessingGroup" xmlns:wpi="http://schemas.microsoft.com/office/word/2010/wordprocessingInk" xmlns:wne="http://schemas.microsoft.com/office/word/2006/wordml" xmlns:wps="http://schemas.microsoft.com/office/word/2010/wordprocessingShape" mc:Ignorable="w14 w15 w16se w16cid w16 w16cex w16sdtdh w16sdtfl w16du wp14">
   <w:p>
     <w:pPr>
       <w:pBdr>
@@ -2123,7 +2175,7 @@
 </file>
 
 <file path=word/footer3.xml><?xml version="1.0" encoding="utf-8"?>
-<w:ftr xmlns:wpc="http://schemas.microsoft.com/office/word/2010/wordprocessingCanvas" xmlns:cx="http://schemas.microsoft.com/office/drawing/2014/chartex" xmlns:cx1="http://schemas.microsoft.com/office/drawing/2015/9/8/chartex" xmlns:cx2="http://schemas.microsoft.com/office/drawing/2015/10/21/chartex" xmlns:cx3="http://schemas.microsoft.com/office/drawing/2016/5/9/chartex" xmlns:cx4="http://schemas.microsoft.com/office/drawing/2016/5/10/chartex" xmlns:cx5="http://schemas.microsoft.com/office/drawing/2016/5/11/chartex" xmlns:cx6="http://schemas.microsoft.com/office/drawing/2016/5/12/chartex" xmlns:cx7="http://schemas.microsoft.com/office/drawing/2016/5/13/chartex" xmlns:cx8="http://schemas.microsoft.com/office/drawing/2016/5/14/chartex" xmlns:mc="http://schemas.openxmlformats.org/markup-compatibility/2006" xmlns:aink="http://schemas.microsoft.com/office/drawing/2016/ink" xmlns:am3d="http://schemas.microsoft.com/office/drawing/2017/model3d" xmlns:o="urn:schemas-microsoft-com:office:office" xmlns:oel="http://schemas.microsoft.com/office/2019/extlst" xmlns:r="http://schemas.openxmlformats.org/officeDocument/2006/relationships" xmlns:m="http://schemas.openxmlformats.org/officeDocument/2006/math" xmlns:v="urn:schemas-microsoft-com:vml" xmlns:wp14="http://schemas.microsoft.com/office/word/2010/wordprocessingDrawing" xmlns:wp="http://schemas.openxmlformats.org/drawingml/2006/wordprocessingDrawing" xmlns:w10="urn:schemas-microsoft-com:office:word" xmlns:w="http://schemas.openxmlformats.org/wordprocessingml/2006/main" xmlns:w14="http://schemas.microsoft.com/office/word/2010/wordml" xmlns:w15="http://schemas.microsoft.com/office/word/2012/wordml" xmlns:w16cex="http://schemas.microsoft.com/office/word/2018/wordml/cex" xmlns:w16cid="http://schemas.microsoft.com/office/word/2016/wordml/cid" xmlns:w16="http://schemas.microsoft.com/office/word/2018/wordml" xmlns:w16sdtdh="http://schemas.microsoft.com/office/word/2020/wordml/sdtdatahash" xmlns:w16se="http://schemas.microsoft.com/office/word/2015/wordml/symex" xmlns:wpg="http://schemas.microsoft.com/office/word/2010/wordprocessingGroup" xmlns:wpi="http://schemas.microsoft.com/office/word/2010/wordprocessingInk" xmlns:wne="http://schemas.microsoft.com/office/word/2006/wordml" xmlns:wps="http://schemas.microsoft.com/office/word/2010/wordprocessingShape" mc:Ignorable="w14 w15 w16se w16cid w16 w16cex w16sdtdh wp14">
+<w:ftr xmlns:wpc="http://schemas.microsoft.com/office/word/2010/wordprocessingCanvas" xmlns:cx="http://schemas.microsoft.com/office/drawing/2014/chartex" xmlns:cx1="http://schemas.microsoft.com/office/drawing/2015/9/8/chartex" xmlns:cx2="http://schemas.microsoft.com/office/drawing/2015/10/21/chartex" xmlns:cx3="http://schemas.microsoft.com/office/drawing/2016/5/9/chartex" xmlns:cx4="http://schemas.microsoft.com/office/drawing/2016/5/10/chartex" xmlns:cx5="http://schemas.microsoft.com/office/drawing/2016/5/11/chartex" xmlns:cx6="http://schemas.microsoft.com/office/drawing/2016/5/12/chartex" xmlns:cx7="http://schemas.microsoft.com/office/drawing/2016/5/13/chartex" xmlns:cx8="http://schemas.microsoft.com/office/drawing/2016/5/14/chartex" xmlns:mc="http://schemas.openxmlformats.org/markup-compatibility/2006" xmlns:aink="http://schemas.microsoft.com/office/drawing/2016/ink" xmlns:am3d="http://schemas.microsoft.com/office/drawing/2017/model3d" xmlns:o="urn:schemas-microsoft-com:office:office" xmlns:oel="http://schemas.microsoft.com/office/2019/extlst" xmlns:r="http://schemas.openxmlformats.org/officeDocument/2006/relationships" xmlns:m="http://schemas.openxmlformats.org/officeDocument/2006/math" xmlns:v="urn:schemas-microsoft-com:vml" xmlns:wp14="http://schemas.microsoft.com/office/word/2010/wordprocessingDrawing" xmlns:wp="http://schemas.openxmlformats.org/drawingml/2006/wordprocessingDrawing" xmlns:w10="urn:schemas-microsoft-com:office:word" xmlns:w="http://schemas.openxmlformats.org/wordprocessingml/2006/main" xmlns:w14="http://schemas.microsoft.com/office/word/2010/wordml" xmlns:w15="http://schemas.microsoft.com/office/word/2012/wordml" xmlns:w16cex="http://schemas.microsoft.com/office/word/2018/wordml/cex" xmlns:w16cid="http://schemas.microsoft.com/office/word/2016/wordml/cid" xmlns:w16="http://schemas.microsoft.com/office/word/2018/wordml" xmlns:w16du="http://schemas.microsoft.com/office/word/2023/wordml/word16du" xmlns:w16sdtdh="http://schemas.microsoft.com/office/word/2020/wordml/sdtdatahash" xmlns:w16sdtfl="http://schemas.microsoft.com/office/word/2024/wordml/sdtformatlock" xmlns:w16se="http://schemas.microsoft.com/office/word/2015/wordml/symex" xmlns:wpg="http://schemas.microsoft.com/office/word/2010/wordprocessingGroup" xmlns:wpi="http://schemas.microsoft.com/office/word/2010/wordprocessingInk" xmlns:wne="http://schemas.microsoft.com/office/word/2006/wordml" xmlns:wps="http://schemas.microsoft.com/office/word/2010/wordprocessingShape" mc:Ignorable="w14 w15 w16se w16cid w16 w16cex w16sdtdh w16sdtfl w16du wp14">
   <w:p>
     <w:pPr>
       <w:pBdr>
@@ -2144,7 +2196,7 @@
 </file>
 
 <file path=word/footnotes.xml><?xml version="1.0" encoding="utf-8"?>
-<w:footnotes xmlns:wpc="http://schemas.microsoft.com/office/word/2010/wordprocessingCanvas" xmlns:cx="http://schemas.microsoft.com/office/drawing/2014/chartex" xmlns:cx1="http://schemas.microsoft.com/office/drawing/2015/9/8/chartex" xmlns:cx2="http://schemas.microsoft.com/office/drawing/2015/10/21/chartex" xmlns:cx3="http://schemas.microsoft.com/office/drawing/2016/5/9/chartex" xmlns:cx4="http://schemas.microsoft.com/office/drawing/2016/5/10/chartex" xmlns:cx5="http://schemas.microsoft.com/office/drawing/2016/5/11/chartex" xmlns:cx6="http://schemas.microsoft.com/office/drawing/2016/5/12/chartex" xmlns:cx7="http://schemas.microsoft.com/office/drawing/2016/5/13/chartex" xmlns:cx8="http://schemas.microsoft.com/office/drawing/2016/5/14/chartex" xmlns:mc="http://schemas.openxmlformats.org/markup-compatibility/2006" xmlns:aink="http://schemas.microsoft.com/office/drawing/2016/ink" xmlns:am3d="http://schemas.microsoft.com/office/drawing/2017/model3d" xmlns:o="urn:schemas-microsoft-com:office:office" xmlns:oel="http://schemas.microsoft.com/office/2019/extlst" xmlns:r="http://schemas.openxmlformats.org/officeDocument/2006/relationships" xmlns:m="http://schemas.openxmlformats.org/officeDocument/2006/math" xmlns:v="urn:schemas-microsoft-com:vml" xmlns:wp14="http://schemas.microsoft.com/office/word/2010/wordprocessingDrawing" xmlns:wp="http://schemas.openxmlformats.org/drawingml/2006/wordprocessingDrawing" xmlns:w10="urn:schemas-microsoft-com:office:word" xmlns:w="http://schemas.openxmlformats.org/wordprocessingml/2006/main" xmlns:w14="http://schemas.microsoft.com/office/word/2010/wordml" xmlns:w15="http://schemas.microsoft.com/office/word/2012/wordml" xmlns:w16cex="http://schemas.microsoft.com/office/word/2018/wordml/cex" xmlns:w16cid="http://schemas.microsoft.com/office/word/2016/wordml/cid" xmlns:w16="http://schemas.microsoft.com/office/word/2018/wordml" xmlns:w16sdtdh="http://schemas.microsoft.com/office/word/2020/wordml/sdtdatahash" xmlns:w16se="http://schemas.microsoft.com/office/word/2015/wordml/symex" xmlns:wpg="http://schemas.microsoft.com/office/word/2010/wordprocessingGroup" xmlns:wpi="http://schemas.microsoft.com/office/word/2010/wordprocessingInk" xmlns:wne="http://schemas.microsoft.com/office/word/2006/wordml" xmlns:wps="http://schemas.microsoft.com/office/word/2010/wordprocessingShape" mc:Ignorable="w14 w15 w16se w16cid w16 w16cex w16sdtdh wp14">
+<w:footnotes xmlns:wpc="http://schemas.microsoft.com/office/word/2010/wordprocessingCanvas" xmlns:cx="http://schemas.microsoft.com/office/drawing/2014/chartex" xmlns:cx1="http://schemas.microsoft.com/office/drawing/2015/9/8/chartex" xmlns:cx2="http://schemas.microsoft.com/office/drawing/2015/10/21/chartex" xmlns:cx3="http://schemas.microsoft.com/office/drawing/2016/5/9/chartex" xmlns:cx4="http://schemas.microsoft.com/office/drawing/2016/5/10/chartex" xmlns:cx5="http://schemas.microsoft.com/office/drawing/2016/5/11/chartex" xmlns:cx6="http://schemas.microsoft.com/office/drawing/2016/5/12/chartex" xmlns:cx7="http://schemas.microsoft.com/office/drawing/2016/5/13/chartex" xmlns:cx8="http://schemas.microsoft.com/office/drawing/2016/5/14/chartex" xmlns:mc="http://schemas.openxmlformats.org/markup-compatibility/2006" xmlns:aink="http://schemas.microsoft.com/office/drawing/2016/ink" xmlns:am3d="http://schemas.microsoft.com/office/drawing/2017/model3d" xmlns:o="urn:schemas-microsoft-com:office:office" xmlns:oel="http://schemas.microsoft.com/office/2019/extlst" xmlns:r="http://schemas.openxmlformats.org/officeDocument/2006/relationships" xmlns:m="http://schemas.openxmlformats.org/officeDocument/2006/math" xmlns:v="urn:schemas-microsoft-com:vml" xmlns:wp14="http://schemas.microsoft.com/office/word/2010/wordprocessingDrawing" xmlns:wp="http://schemas.openxmlformats.org/drawingml/2006/wordprocessingDrawing" xmlns:w10="urn:schemas-microsoft-com:office:word" xmlns:w="http://schemas.openxmlformats.org/wordprocessingml/2006/main" xmlns:w14="http://schemas.microsoft.com/office/word/2010/wordml" xmlns:w15="http://schemas.microsoft.com/office/word/2012/wordml" xmlns:w16cex="http://schemas.microsoft.com/office/word/2018/wordml/cex" xmlns:w16cid="http://schemas.microsoft.com/office/word/2016/wordml/cid" xmlns:w16="http://schemas.microsoft.com/office/word/2018/wordml" xmlns:w16du="http://schemas.microsoft.com/office/word/2023/wordml/word16du" xmlns:w16sdtdh="http://schemas.microsoft.com/office/word/2020/wordml/sdtdatahash" xmlns:w16sdtfl="http://schemas.microsoft.com/office/word/2024/wordml/sdtformatlock" xmlns:w16se="http://schemas.microsoft.com/office/word/2015/wordml/symex" xmlns:wpg="http://schemas.microsoft.com/office/word/2010/wordprocessingGroup" xmlns:wpi="http://schemas.microsoft.com/office/word/2010/wordprocessingInk" xmlns:wne="http://schemas.microsoft.com/office/word/2006/wordml" xmlns:wps="http://schemas.microsoft.com/office/word/2010/wordprocessingShape" mc:Ignorable="w14 w15 w16se w16cid w16 w16cex w16sdtdh w16sdtfl w16du wp14">
   <w:footnote w:type="separator" w:id="-1">
     <w:p>
       <w:pPr>
@@ -2169,7 +2221,7 @@
 </file>
 
 <file path=word/header1.xml><?xml version="1.0" encoding="utf-8"?>
-<w:hdr xmlns:wpc="http://schemas.microsoft.com/office/word/2010/wordprocessingCanvas" xmlns:cx="http://schemas.microsoft.com/office/drawing/2014/chartex" xmlns:cx1="http://schemas.microsoft.com/office/drawing/2015/9/8/chartex" xmlns:cx2="http://schemas.microsoft.com/office/drawing/2015/10/21/chartex" xmlns:cx3="http://schemas.microsoft.com/office/drawing/2016/5/9/chartex" xmlns:cx4="http://schemas.microsoft.com/office/drawing/2016/5/10/chartex" xmlns:cx5="http://schemas.microsoft.com/office/drawing/2016/5/11/chartex" xmlns:cx6="http://schemas.microsoft.com/office/drawing/2016/5/12/chartex" xmlns:cx7="http://schemas.microsoft.com/office/drawing/2016/5/13/chartex" xmlns:cx8="http://schemas.microsoft.com/office/drawing/2016/5/14/chartex" xmlns:mc="http://schemas.openxmlformats.org/markup-compatibility/2006" xmlns:aink="http://schemas.microsoft.com/office/drawing/2016/ink" xmlns:am3d="http://schemas.microsoft.com/office/drawing/2017/model3d" xmlns:o="urn:schemas-microsoft-com:office:office" xmlns:oel="http://schemas.microsoft.com/office/2019/extlst" xmlns:r="http://schemas.openxmlformats.org/officeDocument/2006/relationships" xmlns:m="http://schemas.openxmlformats.org/officeDocument/2006/math" xmlns:v="urn:schemas-microsoft-com:vml" xmlns:wp14="http://schemas.microsoft.com/office/word/2010/wordprocessingDrawing" xmlns:wp="http://schemas.openxmlformats.org/drawingml/2006/wordprocessingDrawing" xmlns:w10="urn:schemas-microsoft-com:office:word" xmlns:w="http://schemas.openxmlformats.org/wordprocessingml/2006/main" xmlns:w14="http://schemas.microsoft.com/office/word/2010/wordml" xmlns:w15="http://schemas.microsoft.com/office/word/2012/wordml" xmlns:w16cex="http://schemas.microsoft.com/office/word/2018/wordml/cex" xmlns:w16cid="http://schemas.microsoft.com/office/word/2016/wordml/cid" xmlns:w16="http://schemas.microsoft.com/office/word/2018/wordml" xmlns:w16sdtdh="http://schemas.microsoft.com/office/word/2020/wordml/sdtdatahash" xmlns:w16se="http://schemas.microsoft.com/office/word/2015/wordml/symex" xmlns:wpg="http://schemas.microsoft.com/office/word/2010/wordprocessingGroup" xmlns:wpi="http://schemas.microsoft.com/office/word/2010/wordprocessingInk" xmlns:wne="http://schemas.microsoft.com/office/word/2006/wordml" xmlns:wps="http://schemas.microsoft.com/office/word/2010/wordprocessingShape" mc:Ignorable="w14 w15 w16se w16cid w16 w16cex w16sdtdh wp14">
+<w:hdr xmlns:wpc="http://schemas.microsoft.com/office/word/2010/wordprocessingCanvas" xmlns:cx="http://schemas.microsoft.com/office/drawing/2014/chartex" xmlns:cx1="http://schemas.microsoft.com/office/drawing/2015/9/8/chartex" xmlns:cx2="http://schemas.microsoft.com/office/drawing/2015/10/21/chartex" xmlns:cx3="http://schemas.microsoft.com/office/drawing/2016/5/9/chartex" xmlns:cx4="http://schemas.microsoft.com/office/drawing/2016/5/10/chartex" xmlns:cx5="http://schemas.microsoft.com/office/drawing/2016/5/11/chartex" xmlns:cx6="http://schemas.microsoft.com/office/drawing/2016/5/12/chartex" xmlns:cx7="http://schemas.microsoft.com/office/drawing/2016/5/13/chartex" xmlns:cx8="http://schemas.microsoft.com/office/drawing/2016/5/14/chartex" xmlns:mc="http://schemas.openxmlformats.org/markup-compatibility/2006" xmlns:aink="http://schemas.microsoft.com/office/drawing/2016/ink" xmlns:am3d="http://schemas.microsoft.com/office/drawing/2017/model3d" xmlns:o="urn:schemas-microsoft-com:office:office" xmlns:oel="http://schemas.microsoft.com/office/2019/extlst" xmlns:r="http://schemas.openxmlformats.org/officeDocument/2006/relationships" xmlns:m="http://schemas.openxmlformats.org/officeDocument/2006/math" xmlns:v="urn:schemas-microsoft-com:vml" xmlns:wp14="http://schemas.microsoft.com/office/word/2010/wordprocessingDrawing" xmlns:wp="http://schemas.openxmlformats.org/drawingml/2006/wordprocessingDrawing" xmlns:w10="urn:schemas-microsoft-com:office:word" xmlns:w="http://schemas.openxmlformats.org/wordprocessingml/2006/main" xmlns:w14="http://schemas.microsoft.com/office/word/2010/wordml" xmlns:w15="http://schemas.microsoft.com/office/word/2012/wordml" xmlns:w16cex="http://schemas.microsoft.com/office/word/2018/wordml/cex" xmlns:w16cid="http://schemas.microsoft.com/office/word/2016/wordml/cid" xmlns:w16="http://schemas.microsoft.com/office/word/2018/wordml" xmlns:w16du="http://schemas.microsoft.com/office/word/2023/wordml/word16du" xmlns:w16sdtdh="http://schemas.microsoft.com/office/word/2020/wordml/sdtdatahash" xmlns:w16sdtfl="http://schemas.microsoft.com/office/word/2024/wordml/sdtformatlock" xmlns:w16se="http://schemas.microsoft.com/office/word/2015/wordml/symex" xmlns:wpg="http://schemas.microsoft.com/office/word/2010/wordprocessingGroup" xmlns:wpi="http://schemas.microsoft.com/office/word/2010/wordprocessingInk" xmlns:wne="http://schemas.microsoft.com/office/word/2006/wordml" xmlns:wps="http://schemas.microsoft.com/office/word/2010/wordprocessingShape" mc:Ignorable="w14 w15 w16se w16cid w16 w16cex w16sdtdh w16sdtfl w16du wp14">
   <w:p>
     <w:pPr>
       <w:pBdr>
@@ -2190,7 +2242,7 @@
 </file>
 
 <file path=word/header2.xml><?xml version="1.0" encoding="utf-8"?>
-<w:hdr xmlns:wpc="http://schemas.microsoft.com/office/word/2010/wordprocessingCanvas" xmlns:cx="http://schemas.microsoft.com/office/drawing/2014/chartex" xmlns:cx1="http://schemas.microsoft.com/office/drawing/2015/9/8/chartex" xmlns:cx2="http://schemas.microsoft.com/office/drawing/2015/10/21/chartex" xmlns:cx3="http://schemas.microsoft.com/office/drawing/2016/5/9/chartex" xmlns:cx4="http://schemas.microsoft.com/office/drawing/2016/5/10/chartex" xmlns:cx5="http://schemas.microsoft.com/office/drawing/2016/5/11/chartex" xmlns:cx6="http://schemas.microsoft.com/office/drawing/2016/5/12/chartex" xmlns:cx7="http://schemas.microsoft.com/office/drawing/2016/5/13/chartex" xmlns:cx8="http://schemas.microsoft.com/office/drawing/2016/5/14/chartex" xmlns:mc="http://schemas.openxmlformats.org/markup-compatibility/2006" xmlns:aink="http://schemas.microsoft.com/office/drawing/2016/ink" xmlns:am3d="http://schemas.microsoft.com/office/drawing/2017/model3d" xmlns:o="urn:schemas-microsoft-com:office:office" xmlns:oel="http://schemas.microsoft.com/office/2019/extlst" xmlns:r="http://schemas.openxmlformats.org/officeDocument/2006/relationships" xmlns:m="http://schemas.openxmlformats.org/officeDocument/2006/math" xmlns:v="urn:schemas-microsoft-com:vml" xmlns:wp14="http://schemas.microsoft.com/office/word/2010/wordprocessingDrawing" xmlns:wp="http://schemas.openxmlformats.org/drawingml/2006/wordprocessingDrawing" xmlns:w10="urn:schemas-microsoft-com:office:word" xmlns:w="http://schemas.openxmlformats.org/wordprocessingml/2006/main" xmlns:w14="http://schemas.microsoft.com/office/word/2010/wordml" xmlns:w15="http://schemas.microsoft.com/office/word/2012/wordml" xmlns:w16cex="http://schemas.microsoft.com/office/word/2018/wordml/cex" xmlns:w16cid="http://schemas.microsoft.com/office/word/2016/wordml/cid" xmlns:w16="http://schemas.microsoft.com/office/word/2018/wordml" xmlns:w16sdtdh="http://schemas.microsoft.com/office/word/2020/wordml/sdtdatahash" xmlns:w16se="http://schemas.microsoft.com/office/word/2015/wordml/symex" xmlns:wpg="http://schemas.microsoft.com/office/word/2010/wordprocessingGroup" xmlns:wpi="http://schemas.microsoft.com/office/word/2010/wordprocessingInk" xmlns:wne="http://schemas.microsoft.com/office/word/2006/wordml" xmlns:wps="http://schemas.microsoft.com/office/word/2010/wordprocessingShape" mc:Ignorable="w14 w15 w16se w16cid w16 w16cex w16sdtdh wp14">
+<w:hdr xmlns:wpc="http://schemas.microsoft.com/office/word/2010/wordprocessingCanvas" xmlns:cx="http://schemas.microsoft.com/office/drawing/2014/chartex" xmlns:cx1="http://schemas.microsoft.com/office/drawing/2015/9/8/chartex" xmlns:cx2="http://schemas.microsoft.com/office/drawing/2015/10/21/chartex" xmlns:cx3="http://schemas.microsoft.com/office/drawing/2016/5/9/chartex" xmlns:cx4="http://schemas.microsoft.com/office/drawing/2016/5/10/chartex" xmlns:cx5="http://schemas.microsoft.com/office/drawing/2016/5/11/chartex" xmlns:cx6="http://schemas.microsoft.com/office/drawing/2016/5/12/chartex" xmlns:cx7="http://schemas.microsoft.com/office/drawing/2016/5/13/chartex" xmlns:cx8="http://schemas.microsoft.com/office/drawing/2016/5/14/chartex" xmlns:mc="http://schemas.openxmlformats.org/markup-compatibility/2006" xmlns:aink="http://schemas.microsoft.com/office/drawing/2016/ink" xmlns:am3d="http://schemas.microsoft.com/office/drawing/2017/model3d" xmlns:o="urn:schemas-microsoft-com:office:office" xmlns:oel="http://schemas.microsoft.com/office/2019/extlst" xmlns:r="http://schemas.openxmlformats.org/officeDocument/2006/relationships" xmlns:m="http://schemas.openxmlformats.org/officeDocument/2006/math" xmlns:v="urn:schemas-microsoft-com:vml" xmlns:wp14="http://schemas.microsoft.com/office/word/2010/wordprocessingDrawing" xmlns:wp="http://schemas.openxmlformats.org/drawingml/2006/wordprocessingDrawing" xmlns:w10="urn:schemas-microsoft-com:office:word" xmlns:w="http://schemas.openxmlformats.org/wordprocessingml/2006/main" xmlns:w14="http://schemas.microsoft.com/office/word/2010/wordml" xmlns:w15="http://schemas.microsoft.com/office/word/2012/wordml" xmlns:w16cex="http://schemas.microsoft.com/office/word/2018/wordml/cex" xmlns:w16cid="http://schemas.microsoft.com/office/word/2016/wordml/cid" xmlns:w16="http://schemas.microsoft.com/office/word/2018/wordml" xmlns:w16du="http://schemas.microsoft.com/office/word/2023/wordml/word16du" xmlns:w16sdtdh="http://schemas.microsoft.com/office/word/2020/wordml/sdtdatahash" xmlns:w16sdtfl="http://schemas.microsoft.com/office/word/2024/wordml/sdtformatlock" xmlns:w16se="http://schemas.microsoft.com/office/word/2015/wordml/symex" xmlns:wpg="http://schemas.microsoft.com/office/word/2010/wordprocessingGroup" xmlns:wpi="http://schemas.microsoft.com/office/word/2010/wordprocessingInk" xmlns:wne="http://schemas.microsoft.com/office/word/2006/wordml" xmlns:wps="http://schemas.microsoft.com/office/word/2010/wordprocessingShape" mc:Ignorable="w14 w15 w16se w16cid w16 w16cex w16sdtdh w16sdtfl w16du wp14">
   <w:p>
     <w:pPr>
       <w:pBdr>
@@ -2211,7 +2263,7 @@
         <w:noProof/>
       </w:rPr>
       <w:drawing>
-        <wp:anchor distT="0" distB="0" distL="114300" distR="114300" simplePos="0" relativeHeight="251658240" behindDoc="0" locked="0" layoutInCell="1" allowOverlap="1" wp14:anchorId="1185FAA5" wp14:editId="719C78F6">
+        <wp:anchor distT="0" distB="0" distL="114300" distR="114300" simplePos="0" relativeHeight="251658240" behindDoc="0" locked="0" layoutInCell="1" allowOverlap="1" wp14:anchorId="1185FAA5" wp14:editId="5A00BA41">
           <wp:simplePos x="0" y="0"/>
           <wp:positionH relativeFrom="column">
             <wp:posOffset>5525135</wp:posOffset>
@@ -2277,7 +2329,7 @@
 </file>
 
 <file path=word/header3.xml><?xml version="1.0" encoding="utf-8"?>
-<w:hdr xmlns:wpc="http://schemas.microsoft.com/office/word/2010/wordprocessingCanvas" xmlns:cx="http://schemas.microsoft.com/office/drawing/2014/chartex" xmlns:cx1="http://schemas.microsoft.com/office/drawing/2015/9/8/chartex" xmlns:cx2="http://schemas.microsoft.com/office/drawing/2015/10/21/chartex" xmlns:cx3="http://schemas.microsoft.com/office/drawing/2016/5/9/chartex" xmlns:cx4="http://schemas.microsoft.com/office/drawing/2016/5/10/chartex" xmlns:cx5="http://schemas.microsoft.com/office/drawing/2016/5/11/chartex" xmlns:cx6="http://schemas.microsoft.com/office/drawing/2016/5/12/chartex" xmlns:cx7="http://schemas.microsoft.com/office/drawing/2016/5/13/chartex" xmlns:cx8="http://schemas.microsoft.com/office/drawing/2016/5/14/chartex" xmlns:mc="http://schemas.openxmlformats.org/markup-compatibility/2006" xmlns:aink="http://schemas.microsoft.com/office/drawing/2016/ink" xmlns:am3d="http://schemas.microsoft.com/office/drawing/2017/model3d" xmlns:o="urn:schemas-microsoft-com:office:office" xmlns:oel="http://schemas.microsoft.com/office/2019/extlst" xmlns:r="http://schemas.openxmlformats.org/officeDocument/2006/relationships" xmlns:m="http://schemas.openxmlformats.org/officeDocument/2006/math" xmlns:v="urn:schemas-microsoft-com:vml" xmlns:wp14="http://schemas.microsoft.com/office/word/2010/wordprocessingDrawing" xmlns:wp="http://schemas.openxmlformats.org/drawingml/2006/wordprocessingDrawing" xmlns:w10="urn:schemas-microsoft-com:office:word" xmlns:w="http://schemas.openxmlformats.org/wordprocessingml/2006/main" xmlns:w14="http://schemas.microsoft.com/office/word/2010/wordml" xmlns:w15="http://schemas.microsoft.com/office/word/2012/wordml" xmlns:w16cex="http://schemas.microsoft.com/office/word/2018/wordml/cex" xmlns:w16cid="http://schemas.microsoft.com/office/word/2016/wordml/cid" xmlns:w16="http://schemas.microsoft.com/office/word/2018/wordml" xmlns:w16sdtdh="http://schemas.microsoft.com/office/word/2020/wordml/sdtdatahash" xmlns:w16se="http://schemas.microsoft.com/office/word/2015/wordml/symex" xmlns:wpg="http://schemas.microsoft.com/office/word/2010/wordprocessingGroup" xmlns:wpi="http://schemas.microsoft.com/office/word/2010/wordprocessingInk" xmlns:wne="http://schemas.microsoft.com/office/word/2006/wordml" xmlns:wps="http://schemas.microsoft.com/office/word/2010/wordprocessingShape" mc:Ignorable="w14 w15 w16se w16cid w16 w16cex w16sdtdh wp14">
+<w:hdr xmlns:wpc="http://schemas.microsoft.com/office/word/2010/wordprocessingCanvas" xmlns:cx="http://schemas.microsoft.com/office/drawing/2014/chartex" xmlns:cx1="http://schemas.microsoft.com/office/drawing/2015/9/8/chartex" xmlns:cx2="http://schemas.microsoft.com/office/drawing/2015/10/21/chartex" xmlns:cx3="http://schemas.microsoft.com/office/drawing/2016/5/9/chartex" xmlns:cx4="http://schemas.microsoft.com/office/drawing/2016/5/10/chartex" xmlns:cx5="http://schemas.microsoft.com/office/drawing/2016/5/11/chartex" xmlns:cx6="http://schemas.microsoft.com/office/drawing/2016/5/12/chartex" xmlns:cx7="http://schemas.microsoft.com/office/drawing/2016/5/13/chartex" xmlns:cx8="http://schemas.microsoft.com/office/drawing/2016/5/14/chartex" xmlns:mc="http://schemas.openxmlformats.org/markup-compatibility/2006" xmlns:aink="http://schemas.microsoft.com/office/drawing/2016/ink" xmlns:am3d="http://schemas.microsoft.com/office/drawing/2017/model3d" xmlns:o="urn:schemas-microsoft-com:office:office" xmlns:oel="http://schemas.microsoft.com/office/2019/extlst" xmlns:r="http://schemas.openxmlformats.org/officeDocument/2006/relationships" xmlns:m="http://schemas.openxmlformats.org/officeDocument/2006/math" xmlns:v="urn:schemas-microsoft-com:vml" xmlns:wp14="http://schemas.microsoft.com/office/word/2010/wordprocessingDrawing" xmlns:wp="http://schemas.openxmlformats.org/drawingml/2006/wordprocessingDrawing" xmlns:w10="urn:schemas-microsoft-com:office:word" xmlns:w="http://schemas.openxmlformats.org/wordprocessingml/2006/main" xmlns:w14="http://schemas.microsoft.com/office/word/2010/wordml" xmlns:w15="http://schemas.microsoft.com/office/word/2012/wordml" xmlns:w16cex="http://schemas.microsoft.com/office/word/2018/wordml/cex" xmlns:w16cid="http://schemas.microsoft.com/office/word/2016/wordml/cid" xmlns:w16="http://schemas.microsoft.com/office/word/2018/wordml" xmlns:w16du="http://schemas.microsoft.com/office/word/2023/wordml/word16du" xmlns:w16sdtdh="http://schemas.microsoft.com/office/word/2020/wordml/sdtdatahash" xmlns:w16sdtfl="http://schemas.microsoft.com/office/word/2024/wordml/sdtformatlock" xmlns:w16se="http://schemas.microsoft.com/office/word/2015/wordml/symex" xmlns:wpg="http://schemas.microsoft.com/office/word/2010/wordprocessingGroup" xmlns:wpi="http://schemas.microsoft.com/office/word/2010/wordprocessingInk" xmlns:wne="http://schemas.microsoft.com/office/word/2006/wordml" xmlns:wps="http://schemas.microsoft.com/office/word/2010/wordprocessingShape" mc:Ignorable="w14 w15 w16se w16cid w16 w16cex w16sdtdh w16sdtfl w16du wp14">
   <w:p>
     <w:pPr>
       <w:pBdr>
@@ -2298,7 +2350,7 @@
 </file>
 
 <file path=word/styles.xml><?xml version="1.0" encoding="utf-8"?>
-<w:styles xmlns:mc="http://schemas.openxmlformats.org/markup-compatibility/2006" xmlns:r="http://schemas.openxmlformats.org/officeDocument/2006/relationships" xmlns:w="http://schemas.openxmlformats.org/wordprocessingml/2006/main" xmlns:w14="http://schemas.microsoft.com/office/word/2010/wordml" xmlns:w15="http://schemas.microsoft.com/office/word/2012/wordml" xmlns:w16cex="http://schemas.microsoft.com/office/word/2018/wordml/cex" xmlns:w16cid="http://schemas.microsoft.com/office/word/2016/wordml/cid" xmlns:w16="http://schemas.microsoft.com/office/word/2018/wordml" xmlns:w16sdtdh="http://schemas.microsoft.com/office/word/2020/wordml/sdtdatahash" xmlns:w16se="http://schemas.microsoft.com/office/word/2015/wordml/symex" mc:Ignorable="w14 w15 w16se w16cid w16 w16cex w16sdtdh">
+<w:styles xmlns:mc="http://schemas.openxmlformats.org/markup-compatibility/2006" xmlns:r="http://schemas.openxmlformats.org/officeDocument/2006/relationships" xmlns:w="http://schemas.openxmlformats.org/wordprocessingml/2006/main" xmlns:w14="http://schemas.microsoft.com/office/word/2010/wordml" xmlns:w15="http://schemas.microsoft.com/office/word/2012/wordml" xmlns:w16cex="http://schemas.microsoft.com/office/word/2018/wordml/cex" xmlns:w16cid="http://schemas.microsoft.com/office/word/2016/wordml/cid" xmlns:w16="http://schemas.microsoft.com/office/word/2018/wordml" xmlns:w16du="http://schemas.microsoft.com/office/word/2023/wordml/word16du" xmlns:w16sdtdh="http://schemas.microsoft.com/office/word/2020/wordml/sdtdatahash" xmlns:w16sdtfl="http://schemas.microsoft.com/office/word/2024/wordml/sdtformatlock" xmlns:w16se="http://schemas.microsoft.com/office/word/2015/wordml/symex" mc:Ignorable="w14 w15 w16se w16cid w16 w16cex w16sdtdh w16sdtfl w16du">
   <w:docDefaults>
     <w:rPrDefault>
       <w:rPr>

</xml_diff>

<commit_message>
chore: atualiza template de manutencao oficial
</commit_message>
<xml_diff>
--- a/apps/backend/templates/sige-ordem-servico-avulsa-externa.docx
+++ b/apps/backend/templates/sige-ordem-servico-avulsa-externa.docx
@@ -1573,7 +1573,21 @@
                 <w:rFonts w:ascii="Helvetica" w:hAnsi="Helvetica" w:cs="Helvetica"/>
                 <w:shd w:val="clear" w:color="auto" w:fill="FFFFFF"/>
               </w:rPr>
-              <w:t>##CosideracoesDoTecnico##</w:t>
+              <w:t>##</w:t>
+            </w:r>
+            <w:r>
+              <w:rPr>
+                <w:rFonts w:ascii="Helvetica" w:hAnsi="Helvetica" w:cs="Helvetica"/>
+                <w:shd w:val="clear" w:color="auto" w:fill="FFFFFF"/>
+              </w:rPr>
+              <w:t>C</w:t>
+            </w:r>
+            <w:r>
+              <w:rPr>
+                <w:rFonts w:ascii="Helvetica" w:hAnsi="Helvetica" w:cs="Helvetica"/>
+                <w:shd w:val="clear" w:color="auto" w:fill="FFFFFF"/>
+              </w:rPr>
+              <w:t>osideracoesDoTecnico##</w:t>
             </w:r>
           </w:p>
         </w:tc>
@@ -1613,460 +1627,37 @@
         <w:tab/>
       </w:r>
     </w:p>
-    <w:tbl>
-      <w:tblPr>
-        <w:tblW w:w="10561" w:type="dxa"/>
+    <w:p>
+      <w:pPr>
+        <w:pBdr>
+          <w:top w:val="nil"/>
+          <w:left w:val="nil"/>
+          <w:bottom w:val="nil"/>
+          <w:right w:val="nil"/>
+          <w:between w:val="nil"/>
+        </w:pBdr>
+        <w:spacing w:after="0" w:line="240" w:lineRule="auto"/>
+      </w:pPr>
+    </w:p>
+    <w:p>
+      <w:pPr>
+        <w:spacing w:after="0" w:line="240" w:lineRule="auto"/>
         <w:jc w:val="center"/>
-        <w:tblCellMar>
-          <w:left w:w="70" w:type="dxa"/>
-          <w:right w:w="70" w:type="dxa"/>
-        </w:tblCellMar>
-        <w:tblLook w:val="04A0" w:firstRow="1" w:lastRow="0" w:firstColumn="1" w:lastColumn="0" w:noHBand="0" w:noVBand="1"/>
-      </w:tblPr>
-      <w:tblGrid>
-        <w:gridCol w:w="3848"/>
-        <w:gridCol w:w="959"/>
-        <w:gridCol w:w="959"/>
-        <w:gridCol w:w="959"/>
-        <w:gridCol w:w="3836"/>
-      </w:tblGrid>
-      <w:tr>
-        <w:trPr>
-          <w:trHeight w:val="300"/>
-          <w:jc w:val="center"/>
-        </w:trPr>
-        <w:tc>
-          <w:tcPr>
-            <w:tcW w:w="10561" w:type="dxa"/>
-            <w:gridSpan w:val="5"/>
-            <w:tcBorders>
-              <w:top w:val="single" w:sz="4" w:space="0" w:color="auto"/>
-              <w:left w:val="single" w:sz="4" w:space="0" w:color="auto"/>
-              <w:bottom w:val="nil"/>
-              <w:right w:val="single" w:sz="4" w:space="0" w:color="000000"/>
-            </w:tcBorders>
-            <w:shd w:val="clear" w:color="000000" w:fill="FFFFFF"/>
-            <w:noWrap/>
-            <w:vAlign w:val="center"/>
-            <w:hideMark/>
-          </w:tcPr>
-          <w:p>
-            <w:pPr>
-              <w:spacing w:after="0" w:line="240" w:lineRule="auto"/>
-              <w:jc w:val="center"/>
-              <w:rPr>
-                <w:rFonts w:ascii="ArialNormal" w:eastAsia="Times New Roman" w:hAnsi="ArialNormal" w:cs="ArialNormal"/>
-                <w:sz w:val="18"/>
-                <w:szCs w:val="18"/>
-              </w:rPr>
-            </w:pPr>
-            <w:r>
-              <w:rPr>
-                <w:rFonts w:ascii="ArialNormal" w:eastAsia="Times New Roman" w:hAnsi="ArialNormal" w:cs="ArialNormal"/>
-                <w:sz w:val="18"/>
-                <w:szCs w:val="18"/>
-              </w:rPr>
-              <w:t xml:space="preserve">Declaro que os serviços descritos neste relatório foram prestados e dados como aceitos por mim nesta data </w:t>
-            </w:r>
-          </w:p>
-          <w:p>
-            <w:pPr>
-              <w:spacing w:after="0" w:line="240" w:lineRule="auto"/>
-              <w:jc w:val="center"/>
-              <w:rPr>
-                <w:rFonts w:ascii="ArialNormal" w:eastAsia="Times New Roman" w:hAnsi="ArialNormal"/>
-                <w:sz w:val="18"/>
-                <w:szCs w:val="18"/>
-              </w:rPr>
-            </w:pPr>
-            <w:r>
-              <w:rPr>
-                <w:rFonts w:ascii="ArialNormal" w:eastAsia="Times New Roman" w:hAnsi="ArialNormal" w:cs="ArialNormal"/>
-                <w:sz w:val="18"/>
-                <w:szCs w:val="18"/>
-              </w:rPr>
-              <w:t xml:space="preserve"> ___ /___ /_____.</w:t>
-            </w:r>
-          </w:p>
-        </w:tc>
-      </w:tr>
-      <w:tr>
-        <w:trPr>
-          <w:trHeight w:val="300"/>
-          <w:jc w:val="center"/>
-        </w:trPr>
-        <w:tc>
-          <w:tcPr>
-            <w:tcW w:w="3848" w:type="dxa"/>
-            <w:tcBorders>
-              <w:top w:val="nil"/>
-              <w:left w:val="single" w:sz="4" w:space="0" w:color="auto"/>
-              <w:bottom w:val="single" w:sz="4" w:space="0" w:color="auto"/>
-              <w:right w:val="nil"/>
-            </w:tcBorders>
-            <w:shd w:val="clear" w:color="000000" w:fill="FFFFFF"/>
-            <w:noWrap/>
-            <w:vAlign w:val="center"/>
-            <w:hideMark/>
-          </w:tcPr>
-          <w:p>
-            <w:pPr>
-              <w:spacing w:after="0" w:line="240" w:lineRule="auto"/>
-              <w:rPr>
-                <w:rFonts w:ascii="ArialNormal" w:eastAsia="Times New Roman" w:hAnsi="ArialNormal"/>
-                <w:sz w:val="18"/>
-                <w:szCs w:val="18"/>
-              </w:rPr>
-            </w:pPr>
-            <w:r>
-              <w:rPr>
-                <w:rFonts w:ascii="ArialNormal" w:eastAsia="Times New Roman" w:hAnsi="ArialNormal"/>
-                <w:sz w:val="18"/>
-                <w:szCs w:val="18"/>
-              </w:rPr>
-              <w:t> </w:t>
-            </w:r>
-            <w:r>
-              <w:rPr>
-                <w:rFonts w:ascii="ArialNormal" w:eastAsia="Times New Roman" w:hAnsi="ArialNormal"/>
-                <w:sz w:val="18"/>
-                <w:szCs w:val="18"/>
-              </w:rPr>
-              <w:t>##AssinaturaTecnico##</w:t>
-            </w:r>
-          </w:p>
-        </w:tc>
-        <w:tc>
-          <w:tcPr>
-            <w:tcW w:w="959" w:type="dxa"/>
-            <w:tcBorders>
-              <w:top w:val="nil"/>
-              <w:left w:val="nil"/>
-              <w:bottom w:val="nil"/>
-              <w:right w:val="nil"/>
-            </w:tcBorders>
-            <w:shd w:val="clear" w:color="000000" w:fill="FFFFFF"/>
-            <w:noWrap/>
-            <w:vAlign w:val="bottom"/>
-            <w:hideMark/>
-          </w:tcPr>
-          <w:p>
-            <w:pPr>
-              <w:spacing w:after="0" w:line="240" w:lineRule="auto"/>
-              <w:rPr>
-                <w:rFonts w:eastAsia="Times New Roman"/>
-                <w:color w:val="000000"/>
-                <w:sz w:val="22"/>
-                <w:szCs w:val="22"/>
-              </w:rPr>
-            </w:pPr>
-            <w:r>
-              <w:rPr>
-                <w:rFonts w:eastAsia="Times New Roman"/>
-                <w:color w:val="000000"/>
-                <w:sz w:val="22"/>
-                <w:szCs w:val="22"/>
-              </w:rPr>
-              <w:t> </w:t>
-            </w:r>
-          </w:p>
-        </w:tc>
-        <w:tc>
-          <w:tcPr>
-            <w:tcW w:w="959" w:type="dxa"/>
-            <w:tcBorders>
-              <w:top w:val="nil"/>
-              <w:left w:val="nil"/>
-              <w:bottom w:val="nil"/>
-              <w:right w:val="nil"/>
-            </w:tcBorders>
-            <w:shd w:val="clear" w:color="000000" w:fill="FFFFFF"/>
-            <w:noWrap/>
-            <w:vAlign w:val="bottom"/>
-            <w:hideMark/>
-          </w:tcPr>
-          <w:p>
-            <w:pPr>
-              <w:spacing w:after="0" w:line="240" w:lineRule="auto"/>
-              <w:rPr>
-                <w:rFonts w:eastAsia="Times New Roman"/>
-                <w:color w:val="000000"/>
-                <w:sz w:val="22"/>
-                <w:szCs w:val="22"/>
-              </w:rPr>
-            </w:pPr>
-            <w:r>
-              <w:rPr>
-                <w:rFonts w:eastAsia="Times New Roman"/>
-                <w:color w:val="000000"/>
-                <w:sz w:val="22"/>
-                <w:szCs w:val="22"/>
-              </w:rPr>
-              <w:t> </w:t>
-            </w:r>
-          </w:p>
-        </w:tc>
-        <w:tc>
-          <w:tcPr>
-            <w:tcW w:w="959" w:type="dxa"/>
-            <w:tcBorders>
-              <w:top w:val="nil"/>
-              <w:left w:val="nil"/>
-              <w:bottom w:val="nil"/>
-              <w:right w:val="nil"/>
-            </w:tcBorders>
-            <w:shd w:val="clear" w:color="000000" w:fill="FFFFFF"/>
-            <w:noWrap/>
-            <w:vAlign w:val="bottom"/>
-            <w:hideMark/>
-          </w:tcPr>
-          <w:p>
-            <w:pPr>
-              <w:spacing w:after="0" w:line="240" w:lineRule="auto"/>
-              <w:rPr>
-                <w:rFonts w:eastAsia="Times New Roman"/>
-                <w:color w:val="000000"/>
-                <w:sz w:val="22"/>
-                <w:szCs w:val="22"/>
-              </w:rPr>
-            </w:pPr>
-            <w:r>
-              <w:rPr>
-                <w:rFonts w:eastAsia="Times New Roman"/>
-                <w:color w:val="000000"/>
-                <w:sz w:val="22"/>
-                <w:szCs w:val="22"/>
-              </w:rPr>
-              <w:t> </w:t>
-            </w:r>
-          </w:p>
-        </w:tc>
-        <w:tc>
-          <w:tcPr>
-            <w:tcW w:w="3836" w:type="dxa"/>
-            <w:tcBorders>
-              <w:top w:val="nil"/>
-              <w:left w:val="nil"/>
-              <w:bottom w:val="single" w:sz="4" w:space="0" w:color="auto"/>
-              <w:right w:val="single" w:sz="4" w:space="0" w:color="000000"/>
-            </w:tcBorders>
-            <w:shd w:val="clear" w:color="000000" w:fill="FFFFFF"/>
-            <w:noWrap/>
-            <w:vAlign w:val="center"/>
-            <w:hideMark/>
-          </w:tcPr>
-          <w:p>
-            <w:pPr>
-              <w:spacing w:after="0" w:line="240" w:lineRule="auto"/>
-              <w:rPr>
-                <w:rFonts w:ascii="ArialNormal" w:eastAsia="Times New Roman" w:hAnsi="ArialNormal"/>
-                <w:sz w:val="18"/>
-                <w:szCs w:val="18"/>
-              </w:rPr>
-            </w:pPr>
-            <w:r>
-              <w:rPr>
-                <w:rFonts w:ascii="ArialNormal" w:eastAsia="Times New Roman" w:hAnsi="ArialNormal"/>
-                <w:sz w:val="18"/>
-                <w:szCs w:val="18"/>
-              </w:rPr>
-              <w:t> </w:t>
-            </w:r>
-            <w:r>
-              <w:rPr>
-                <w:rFonts w:ascii="ArialNormal" w:eastAsia="Times New Roman" w:hAnsi="ArialNormal"/>
-                <w:sz w:val="18"/>
-                <w:szCs w:val="18"/>
-              </w:rPr>
-              <w:t>##AssinaturaCliente##</w:t>
-            </w:r>
-          </w:p>
-        </w:tc>
-      </w:tr>
-      <w:tr>
-        <w:trPr>
-          <w:trHeight w:val="300"/>
-          <w:jc w:val="center"/>
-        </w:trPr>
-        <w:tc>
-          <w:tcPr>
-            <w:tcW w:w="3848" w:type="dxa"/>
-            <w:tcBorders>
-              <w:top w:val="nil"/>
-              <w:left w:val="single" w:sz="4" w:space="0" w:color="auto"/>
-              <w:bottom w:val="single" w:sz="4" w:space="0" w:color="auto"/>
-              <w:right w:val="nil"/>
-            </w:tcBorders>
-            <w:shd w:val="clear" w:color="000000" w:fill="FFFFFF"/>
-            <w:noWrap/>
-            <w:vAlign w:val="bottom"/>
-            <w:hideMark/>
-          </w:tcPr>
-          <w:p>
-            <w:pPr>
-              <w:spacing w:after="0" w:line="240" w:lineRule="auto"/>
-              <w:jc w:val="center"/>
-              <w:rPr>
-                <w:rFonts w:ascii="ArialNormal" w:eastAsia="Times New Roman" w:hAnsi="ArialNormal"/>
-                <w:color w:val="000000"/>
-                <w:sz w:val="18"/>
-                <w:szCs w:val="18"/>
-              </w:rPr>
-            </w:pPr>
-            <w:r>
-              <w:rPr>
-                <w:rFonts w:ascii="ArialNormal" w:eastAsia="Times New Roman" w:hAnsi="ArialNormal"/>
-                <w:color w:val="000000"/>
-                <w:sz w:val="18"/>
-                <w:szCs w:val="18"/>
-              </w:rPr>
-              <w:t>Assinatura do Técnico</w:t>
-            </w:r>
-          </w:p>
-        </w:tc>
-        <w:tc>
-          <w:tcPr>
-            <w:tcW w:w="959" w:type="dxa"/>
-            <w:tcBorders>
-              <w:top w:val="nil"/>
-              <w:left w:val="nil"/>
-              <w:bottom w:val="single" w:sz="4" w:space="0" w:color="auto"/>
-              <w:right w:val="nil"/>
-            </w:tcBorders>
-            <w:shd w:val="clear" w:color="000000" w:fill="FFFFFF"/>
-            <w:noWrap/>
-            <w:vAlign w:val="bottom"/>
-            <w:hideMark/>
-          </w:tcPr>
-          <w:p>
-            <w:pPr>
-              <w:spacing w:after="0" w:line="240" w:lineRule="auto"/>
-              <w:rPr>
-                <w:rFonts w:eastAsia="Times New Roman"/>
-                <w:color w:val="000000"/>
-                <w:sz w:val="22"/>
-                <w:szCs w:val="22"/>
-              </w:rPr>
-            </w:pPr>
-            <w:r>
-              <w:rPr>
-                <w:rFonts w:eastAsia="Times New Roman"/>
-                <w:color w:val="000000"/>
-                <w:sz w:val="22"/>
-                <w:szCs w:val="22"/>
-              </w:rPr>
-              <w:t> </w:t>
-            </w:r>
-          </w:p>
-        </w:tc>
-        <w:tc>
-          <w:tcPr>
-            <w:tcW w:w="959" w:type="dxa"/>
-            <w:tcBorders>
-              <w:top w:val="nil"/>
-              <w:left w:val="nil"/>
-              <w:bottom w:val="single" w:sz="4" w:space="0" w:color="auto"/>
-              <w:right w:val="nil"/>
-            </w:tcBorders>
-            <w:shd w:val="clear" w:color="000000" w:fill="FFFFFF"/>
-            <w:noWrap/>
-            <w:vAlign w:val="bottom"/>
-            <w:hideMark/>
-          </w:tcPr>
-          <w:p>
-            <w:pPr>
-              <w:spacing w:after="0" w:line="240" w:lineRule="auto"/>
-              <w:rPr>
-                <w:rFonts w:eastAsia="Times New Roman"/>
-                <w:color w:val="000000"/>
-                <w:sz w:val="22"/>
-                <w:szCs w:val="22"/>
-              </w:rPr>
-            </w:pPr>
-            <w:r>
-              <w:rPr>
-                <w:rFonts w:eastAsia="Times New Roman"/>
-                <w:color w:val="000000"/>
-                <w:sz w:val="22"/>
-                <w:szCs w:val="22"/>
-              </w:rPr>
-              <w:t> </w:t>
-            </w:r>
-          </w:p>
-        </w:tc>
-        <w:tc>
-          <w:tcPr>
-            <w:tcW w:w="959" w:type="dxa"/>
-            <w:tcBorders>
-              <w:top w:val="nil"/>
-              <w:left w:val="nil"/>
-              <w:bottom w:val="single" w:sz="4" w:space="0" w:color="auto"/>
-              <w:right w:val="nil"/>
-            </w:tcBorders>
-            <w:shd w:val="clear" w:color="000000" w:fill="FFFFFF"/>
-            <w:noWrap/>
-            <w:vAlign w:val="bottom"/>
-            <w:hideMark/>
-          </w:tcPr>
-          <w:p>
-            <w:pPr>
-              <w:spacing w:after="0" w:line="240" w:lineRule="auto"/>
-              <w:rPr>
-                <w:rFonts w:eastAsia="Times New Roman"/>
-                <w:color w:val="000000"/>
-                <w:sz w:val="22"/>
-                <w:szCs w:val="22"/>
-              </w:rPr>
-            </w:pPr>
-            <w:r>
-              <w:rPr>
-                <w:rFonts w:eastAsia="Times New Roman"/>
-                <w:color w:val="000000"/>
-                <w:sz w:val="22"/>
-                <w:szCs w:val="22"/>
-              </w:rPr>
-              <w:t> </w:t>
-            </w:r>
-          </w:p>
-        </w:tc>
-        <w:tc>
-          <w:tcPr>
-            <w:tcW w:w="3836" w:type="dxa"/>
-            <w:tcBorders>
-              <w:top w:val="nil"/>
-              <w:left w:val="nil"/>
-              <w:bottom w:val="single" w:sz="4" w:space="0" w:color="auto"/>
-              <w:right w:val="single" w:sz="4" w:space="0" w:color="000000"/>
-            </w:tcBorders>
-            <w:shd w:val="clear" w:color="000000" w:fill="FFFFFF"/>
-            <w:noWrap/>
-            <w:vAlign w:val="bottom"/>
-            <w:hideMark/>
-          </w:tcPr>
-          <w:p>
-            <w:pPr>
-              <w:spacing w:after="0" w:line="240" w:lineRule="auto"/>
-              <w:jc w:val="center"/>
-              <w:rPr>
-                <w:rFonts w:eastAsia="Times New Roman"/>
-                <w:color w:val="000000"/>
-                <w:sz w:val="22"/>
-                <w:szCs w:val="22"/>
-              </w:rPr>
-            </w:pPr>
-            <w:r>
-              <w:rPr>
-                <w:rFonts w:eastAsia="Times New Roman"/>
-                <w:color w:val="000000"/>
-                <w:sz w:val="22"/>
-                <w:szCs w:val="22"/>
-              </w:rPr>
-              <w:t xml:space="preserve">  Assinatura do Cliente</w:t>
-            </w:r>
-          </w:p>
-        </w:tc>
-      </w:tr>
-    </w:tbl>
+        <w:rPr>
+          <w:rFonts w:ascii="ArialNormal" w:eastAsia="Times New Roman" w:hAnsi="ArialNormal" w:cs="ArialNormal"/>
+          <w:sz w:val="18"/>
+          <w:szCs w:val="18"/>
+        </w:rPr>
+      </w:pPr>
+      <w:r>
+        <w:rPr>
+          <w:rFonts w:ascii="ArialNormal" w:eastAsia="Times New Roman" w:hAnsi="ArialNormal" w:cs="ArialNormal"/>
+          <w:sz w:val="18"/>
+          <w:szCs w:val="18"/>
+        </w:rPr>
+        <w:t xml:space="preserve">Declaro que os serviços descritos neste relatório foram prestados e dados como aceitos por mim nesta data </w:t>
+      </w:r>
+    </w:p>
     <w:p>
       <w:pPr>
         <w:pBdr>
@@ -2090,6 +1681,153 @@
         </w:pBdr>
         <w:spacing w:after="0" w:line="240" w:lineRule="auto"/>
       </w:pPr>
+    </w:p>
+    <w:p>
+      <w:pPr>
+        <w:pBdr>
+          <w:top w:val="nil"/>
+          <w:left w:val="nil"/>
+          <w:bottom w:val="nil"/>
+          <w:right w:val="nil"/>
+          <w:between w:val="nil"/>
+        </w:pBdr>
+        <w:spacing w:after="0" w:line="240" w:lineRule="auto"/>
+        <w:rPr>
+          <w:rFonts w:ascii="ArialNormal" w:eastAsia="Times New Roman" w:hAnsi="ArialNormal"/>
+          <w:sz w:val="18"/>
+          <w:szCs w:val="18"/>
+        </w:rPr>
+      </w:pPr>
+      <w:r>
+        <w:rPr>
+          <w:rFonts w:ascii="ArialNormal" w:eastAsia="Times New Roman" w:hAnsi="ArialNormal"/>
+          <w:color w:val="000000"/>
+          <w:sz w:val="18"/>
+          <w:szCs w:val="18"/>
+        </w:rPr>
+        <w:t>Assinatura do Técnico</w:t>
+      </w:r>
+      <w:r>
+        <w:rPr>
+          <w:rFonts w:ascii="ArialNormal" w:eastAsia="Times New Roman" w:hAnsi="ArialNormal"/>
+          <w:color w:val="000000"/>
+          <w:sz w:val="18"/>
+          <w:szCs w:val="18"/>
+        </w:rPr>
+        <w:t>:</w:t>
+      </w:r>
+      <w:r>
+        <w:rPr>
+          <w:rFonts w:ascii="ArialNormal" w:eastAsia="Times New Roman" w:hAnsi="ArialNormal"/>
+          <w:color w:val="000000"/>
+          <w:sz w:val="18"/>
+          <w:szCs w:val="18"/>
+        </w:rPr>
+        <w:br/>
+      </w:r>
+      <w:r>
+        <w:rPr>
+          <w:rFonts w:ascii="ArialNormal" w:eastAsia="Times New Roman" w:hAnsi="ArialNormal"/>
+          <w:color w:val="000000"/>
+          <w:sz w:val="18"/>
+          <w:szCs w:val="18"/>
+        </w:rPr>
+        <w:br/>
+      </w:r>
+      <w:r>
+        <w:rPr>
+          <w:rFonts w:ascii="ArialNormal" w:eastAsia="Times New Roman" w:hAnsi="ArialNormal"/>
+          <w:sz w:val="18"/>
+          <w:szCs w:val="18"/>
+        </w:rPr>
+        <w:t>##AssinaturaTecnico##</w:t>
+      </w:r>
+      <w:r>
+        <w:rPr>
+          <w:rFonts w:ascii="ArialNormal" w:eastAsia="Times New Roman" w:hAnsi="ArialNormal"/>
+          <w:sz w:val="18"/>
+          <w:szCs w:val="18"/>
+        </w:rPr>
+        <w:br/>
+      </w:r>
+      <w:r>
+        <w:rPr>
+          <w:rFonts w:ascii="ArialNormal" w:eastAsia="Times New Roman" w:hAnsi="ArialNormal"/>
+          <w:sz w:val="18"/>
+          <w:szCs w:val="18"/>
+        </w:rPr>
+        <w:br/>
+      </w:r>
+      <w:r>
+        <w:rPr>
+          <w:rFonts w:ascii="ArialNormal" w:eastAsia="Times New Roman" w:hAnsi="ArialNormal"/>
+          <w:sz w:val="18"/>
+          <w:szCs w:val="18"/>
+        </w:rPr>
+        <w:br/>
+      </w:r>
+      <w:r>
+        <w:rPr>
+          <w:rFonts w:eastAsia="Times New Roman"/>
+          <w:color w:val="000000"/>
+          <w:sz w:val="22"/>
+          <w:szCs w:val="22"/>
+        </w:rPr>
+        <w:t>Assinatura do Cliente</w:t>
+      </w:r>
+      <w:r>
+        <w:rPr>
+          <w:rFonts w:eastAsia="Times New Roman"/>
+          <w:color w:val="000000"/>
+          <w:sz w:val="22"/>
+          <w:szCs w:val="22"/>
+        </w:rPr>
+        <w:t>:</w:t>
+      </w:r>
+      <w:r>
+        <w:rPr>
+          <w:rFonts w:ascii="ArialNormal" w:eastAsia="Times New Roman" w:hAnsi="ArialNormal"/>
+          <w:sz w:val="18"/>
+          <w:szCs w:val="18"/>
+        </w:rPr>
+        <w:t xml:space="preserve"> </w:t>
+      </w:r>
+      <w:r>
+        <w:rPr>
+          <w:rFonts w:ascii="ArialNormal" w:eastAsia="Times New Roman" w:hAnsi="ArialNormal"/>
+          <w:sz w:val="18"/>
+          <w:szCs w:val="18"/>
+        </w:rPr>
+        <w:t> </w:t>
+      </w:r>
+      <w:r>
+        <w:rPr>
+          <w:rFonts w:ascii="ArialNormal" w:eastAsia="Times New Roman" w:hAnsi="ArialNormal"/>
+          <w:sz w:val="18"/>
+          <w:szCs w:val="18"/>
+        </w:rPr>
+        <w:br/>
+      </w:r>
+    </w:p>
+    <w:p>
+      <w:pPr>
+        <w:pBdr>
+          <w:top w:val="nil"/>
+          <w:left w:val="nil"/>
+          <w:bottom w:val="nil"/>
+          <w:right w:val="nil"/>
+          <w:between w:val="nil"/>
+        </w:pBdr>
+        <w:spacing w:after="0" w:line="240" w:lineRule="auto"/>
+      </w:pPr>
+      <w:r>
+        <w:rPr>
+          <w:rFonts w:ascii="ArialNormal" w:eastAsia="Times New Roman" w:hAnsi="ArialNormal"/>
+          <w:sz w:val="18"/>
+          <w:szCs w:val="18"/>
+        </w:rPr>
+        <w:t>##AssinaturaCliente</w:t>
+      </w:r>
     </w:p>
     <w:sectPr>
       <w:headerReference w:type="even" r:id="rId8"/>

</xml_diff>

<commit_message>
fix: preserva template oficial na geracao da os
</commit_message>
<xml_diff>
--- a/apps/backend/templates/sige-ordem-servico-avulsa-externa.docx
+++ b/apps/backend/templates/sige-ordem-servico-avulsa-externa.docx
@@ -1573,21 +1573,7 @@
                 <w:rFonts w:ascii="Helvetica" w:hAnsi="Helvetica" w:cs="Helvetica"/>
                 <w:shd w:val="clear" w:color="auto" w:fill="FFFFFF"/>
               </w:rPr>
-              <w:t>##</w:t>
-            </w:r>
-            <w:r>
-              <w:rPr>
-                <w:rFonts w:ascii="Helvetica" w:hAnsi="Helvetica" w:cs="Helvetica"/>
-                <w:shd w:val="clear" w:color="auto" w:fill="FFFFFF"/>
-              </w:rPr>
-              <w:t>C</w:t>
-            </w:r>
-            <w:r>
-              <w:rPr>
-                <w:rFonts w:ascii="Helvetica" w:hAnsi="Helvetica" w:cs="Helvetica"/>
-                <w:shd w:val="clear" w:color="auto" w:fill="FFFFFF"/>
-              </w:rPr>
-              <w:t>osideracoesDoTecnico##</w:t>
+              <w:t>##CosideracoesDoTecnico##</w:t>
             </w:r>
           </w:p>
         </w:tc>
@@ -1826,7 +1812,7 @@
           <w:sz w:val="18"/>
           <w:szCs w:val="18"/>
         </w:rPr>
-        <w:t>##AssinaturaCliente</w:t>
+        <w:t>##AssinaturaCliente##</w:t>
       </w:r>
     </w:p>
     <w:sectPr>

</xml_diff>

<commit_message>
fix: encaixa assinaturas no novo template de OS
</commit_message>
<xml_diff>
--- a/apps/backend/templates/sige-ordem-servico-avulsa-externa.docx
+++ b/apps/backend/templates/sige-ordem-servico-avulsa-externa.docx
@@ -1573,7 +1573,21 @@
                 <w:rFonts w:ascii="Helvetica" w:hAnsi="Helvetica" w:cs="Helvetica"/>
                 <w:shd w:val="clear" w:color="auto" w:fill="FFFFFF"/>
               </w:rPr>
-              <w:t>##CosideracoesDoTecnico##</w:t>
+              <w:t>##</w:t>
+            </w:r>
+            <w:r>
+              <w:rPr>
+                <w:rFonts w:ascii="Helvetica" w:hAnsi="Helvetica" w:cs="Helvetica"/>
+                <w:shd w:val="clear" w:color="auto" w:fill="FFFFFF"/>
+              </w:rPr>
+              <w:t>C</w:t>
+            </w:r>
+            <w:r>
+              <w:rPr>
+                <w:rFonts w:ascii="Helvetica" w:hAnsi="Helvetica" w:cs="Helvetica"/>
+                <w:shd w:val="clear" w:color="auto" w:fill="FFFFFF"/>
+              </w:rPr>
+              <w:t>osideracoesDoTecnico##</w:t>
             </w:r>
           </w:p>
         </w:tc>
@@ -1668,6 +1682,78 @@
         <w:spacing w:after="0" w:line="240" w:lineRule="auto"/>
       </w:pPr>
     </w:p>
+    <w:tbl>
+      <w:tblPr>
+        <w:tblStyle w:val="Tabelacomgrade"/>
+        <w:tblW w:w="11246" w:type="dxa"/>
+        <w:tblLook w:val="04A0" w:firstRow="1" w:lastRow="0" w:firstColumn="1" w:lastColumn="0" w:noHBand="0" w:noVBand="1"/>
+      </w:tblPr>
+      <w:tblGrid>
+        <w:gridCol w:w="5623"/>
+        <w:gridCol w:w="5623"/>
+      </w:tblGrid>
+      <w:tr>
+        <w:trPr>
+          <w:trHeight w:val="2126"/>
+        </w:trPr>
+        <w:tc>
+          <w:tcPr>
+            <w:tcW w:w="5623" w:type="dxa"/>
+          </w:tcPr>
+          <w:p>
+            <w:pPr>
+              <w:jc w:val="center"/>
+              <w:rPr>
+                <w:rFonts w:ascii="ArialNormal" w:eastAsia="Times New Roman" w:hAnsi="ArialNormal"/>
+                <w:sz w:val="18"/>
+                <w:szCs w:val="18"/>
+              </w:rPr>
+            </w:pPr>
+            <w:r>
+              <w:rPr>
+                <w:rFonts w:ascii="ArialNormal" w:eastAsia="Times New Roman" w:hAnsi="ArialNormal"/>
+                <w:sz w:val="18"/>
+                <w:szCs w:val="18"/>
+              </w:rPr>
+              <w:t>Assinatura do Cliente:</w:t>
+            </w:r>
+          </w:p>
+        </w:tc>
+        <w:tc>
+          <w:tcPr>
+            <w:tcW w:w="5623" w:type="dxa"/>
+          </w:tcPr>
+          <w:p>
+            <w:pPr>
+              <w:jc w:val="center"/>
+              <w:rPr>
+                <w:rFonts w:ascii="ArialNormal" w:eastAsia="Times New Roman" w:hAnsi="ArialNormal"/>
+                <w:sz w:val="18"/>
+                <w:szCs w:val="18"/>
+              </w:rPr>
+            </w:pPr>
+            <w:r>
+              <w:rPr>
+                <w:rFonts w:ascii="ArialNormal" w:eastAsia="Times New Roman" w:hAnsi="ArialNormal"/>
+                <w:sz w:val="18"/>
+                <w:szCs w:val="18"/>
+              </w:rPr>
+              <w:t>Assinatura do Técnico:</w:t>
+            </w:r>
+          </w:p>
+          <w:p>
+            <w:pPr>
+              <w:jc w:val="center"/>
+              <w:rPr>
+                <w:rFonts w:ascii="ArialNormal" w:eastAsia="Times New Roman" w:hAnsi="ArialNormal"/>
+                <w:sz w:val="18"/>
+                <w:szCs w:val="18"/>
+              </w:rPr>
+            </w:pPr>
+          </w:p>
+        </w:tc>
+      </w:tr>
+    </w:tbl>
     <w:p>
       <w:pPr>
         <w:pBdr>
@@ -1678,122 +1764,13 @@
           <w:between w:val="nil"/>
         </w:pBdr>
         <w:spacing w:after="0" w:line="240" w:lineRule="auto"/>
+        <w:jc w:val="center"/>
         <w:rPr>
           <w:rFonts w:ascii="ArialNormal" w:eastAsia="Times New Roman" w:hAnsi="ArialNormal"/>
           <w:sz w:val="18"/>
           <w:szCs w:val="18"/>
         </w:rPr>
       </w:pPr>
-      <w:r>
-        <w:rPr>
-          <w:rFonts w:ascii="ArialNormal" w:eastAsia="Times New Roman" w:hAnsi="ArialNormal"/>
-          <w:color w:val="000000"/>
-          <w:sz w:val="18"/>
-          <w:szCs w:val="18"/>
-        </w:rPr>
-        <w:t>Assinatura do Técnico</w:t>
-      </w:r>
-      <w:r>
-        <w:rPr>
-          <w:rFonts w:ascii="ArialNormal" w:eastAsia="Times New Roman" w:hAnsi="ArialNormal"/>
-          <w:color w:val="000000"/>
-          <w:sz w:val="18"/>
-          <w:szCs w:val="18"/>
-        </w:rPr>
-        <w:t>:</w:t>
-      </w:r>
-      <w:r>
-        <w:rPr>
-          <w:rFonts w:ascii="ArialNormal" w:eastAsia="Times New Roman" w:hAnsi="ArialNormal"/>
-          <w:color w:val="000000"/>
-          <w:sz w:val="18"/>
-          <w:szCs w:val="18"/>
-        </w:rPr>
-        <w:br/>
-      </w:r>
-      <w:r>
-        <w:rPr>
-          <w:rFonts w:ascii="ArialNormal" w:eastAsia="Times New Roman" w:hAnsi="ArialNormal"/>
-          <w:color w:val="000000"/>
-          <w:sz w:val="18"/>
-          <w:szCs w:val="18"/>
-        </w:rPr>
-        <w:br/>
-      </w:r>
-      <w:r>
-        <w:rPr>
-          <w:rFonts w:ascii="ArialNormal" w:eastAsia="Times New Roman" w:hAnsi="ArialNormal"/>
-          <w:sz w:val="18"/>
-          <w:szCs w:val="18"/>
-        </w:rPr>
-        <w:t>##AssinaturaTecnico##</w:t>
-      </w:r>
-      <w:r>
-        <w:rPr>
-          <w:rFonts w:ascii="ArialNormal" w:eastAsia="Times New Roman" w:hAnsi="ArialNormal"/>
-          <w:sz w:val="18"/>
-          <w:szCs w:val="18"/>
-        </w:rPr>
-        <w:br/>
-      </w:r>
-      <w:r>
-        <w:rPr>
-          <w:rFonts w:ascii="ArialNormal" w:eastAsia="Times New Roman" w:hAnsi="ArialNormal"/>
-          <w:sz w:val="18"/>
-          <w:szCs w:val="18"/>
-        </w:rPr>
-        <w:br/>
-      </w:r>
-      <w:r>
-        <w:rPr>
-          <w:rFonts w:ascii="ArialNormal" w:eastAsia="Times New Roman" w:hAnsi="ArialNormal"/>
-          <w:sz w:val="18"/>
-          <w:szCs w:val="18"/>
-        </w:rPr>
-        <w:br/>
-      </w:r>
-      <w:r>
-        <w:rPr>
-          <w:rFonts w:eastAsia="Times New Roman"/>
-          <w:color w:val="000000"/>
-          <w:sz w:val="22"/>
-          <w:szCs w:val="22"/>
-        </w:rPr>
-        <w:t>Assinatura do Cliente</w:t>
-      </w:r>
-      <w:r>
-        <w:rPr>
-          <w:rFonts w:eastAsia="Times New Roman"/>
-          <w:color w:val="000000"/>
-          <w:sz w:val="22"/>
-          <w:szCs w:val="22"/>
-        </w:rPr>
-        <w:t>:</w:t>
-      </w:r>
-      <w:r>
-        <w:rPr>
-          <w:rFonts w:ascii="ArialNormal" w:eastAsia="Times New Roman" w:hAnsi="ArialNormal"/>
-          <w:sz w:val="18"/>
-          <w:szCs w:val="18"/>
-        </w:rPr>
-        <w:t xml:space="preserve"> </w:t>
-      </w:r>
-      <w:r>
-        <w:rPr>
-          <w:rFonts w:ascii="ArialNormal" w:eastAsia="Times New Roman" w:hAnsi="ArialNormal"/>
-          <w:sz w:val="18"/>
-          <w:szCs w:val="18"/>
-        </w:rPr>
-        <w:t> </w:t>
-      </w:r>
-      <w:r>
-        <w:rPr>
-          <w:rFonts w:ascii="ArialNormal" w:eastAsia="Times New Roman" w:hAnsi="ArialNormal"/>
-          <w:sz w:val="18"/>
-          <w:szCs w:val="18"/>
-        </w:rPr>
-        <w:br/>
-      </w:r>
     </w:p>
     <w:p>
       <w:pPr>
@@ -1805,15 +1782,8 @@
           <w:between w:val="nil"/>
         </w:pBdr>
         <w:spacing w:after="0" w:line="240" w:lineRule="auto"/>
+        <w:jc w:val="right"/>
       </w:pPr>
-      <w:r>
-        <w:rPr>
-          <w:rFonts w:ascii="ArialNormal" w:eastAsia="Times New Roman" w:hAnsi="ArialNormal"/>
-          <w:sz w:val="18"/>
-          <w:szCs w:val="18"/>
-        </w:rPr>
-        <w:t>##AssinaturaCliente##</w:t>
-      </w:r>
     </w:p>
     <w:sectPr>
       <w:headerReference w:type="even" r:id="rId8"/>
@@ -2590,7 +2560,6 @@
   <w:style w:type="character" w:default="1" w:styleId="Fontepargpadro">
     <w:name w:val="Default Paragraph Font"/>
     <w:uiPriority w:val="1"/>
-    <w:semiHidden/>
     <w:unhideWhenUsed/>
   </w:style>
   <w:style w:type="table" w:default="1" w:styleId="Tabelanormal">

</xml_diff>